<commit_message>
fix(p4): standardize APA7 journal/volume italic format in all 30 references
Changed *Journal Name*, *Volume*(Issue) → *Journal Name, Volume*(Issue)
per APA7 Publication Manual §9.25 — consistent with P3/P5/P7/P8.
Rebuilt MIR blinded docx and dist/en/ artifact.

https://claude.ai/code/session_01GMFmEtt6FYiJ4MKzBNCLqb
</commit_message>
<xml_diff>
--- a/dist/manuscripts/en/p4_singapore_en_clean.docx
+++ b/dist/manuscripts/en/p4_singapore_en_clean.docx
@@ -2,7 +2,7 @@
 <file path=word/document.xml><?xml version="1.0" encoding="utf-8"?>
 <w:document xmlns:w="http://schemas.openxmlformats.org/wordprocessingml/2006/main" xmlns:m="http://schemas.openxmlformats.org/officeDocument/2006/math" xmlns:r="http://schemas.openxmlformats.org/officeDocument/2006/relationships" xmlns:o="urn:schemas-microsoft-com:office:office" xmlns:v="urn:schemas-microsoft-com:vml" xmlns:w10="urn:schemas-microsoft-com:office:word" xmlns:a="http://schemas.openxmlformats.org/drawingml/2006/main" xmlns:pic="http://schemas.openxmlformats.org/drawingml/2006/picture" xmlns:wp="http://schemas.openxmlformats.org/drawingml/2006/wordprocessingDrawing">
   <w:body>
-    <w:bookmarkStart w:id="111" w:name="X07c3a2f9ec246b5120b9b19625fb58c0a5f9521"/>
+    <w:bookmarkStart w:id="102" w:name="X07c3a2f9ec246b5120b9b19625fb58c0a5f9521"/>
     <w:p>
       <w:pPr>
         <w:pStyle w:val="Heading1"/>
@@ -388,7 +388,7 @@
     </w:p>
     <w:bookmarkEnd w:id="28"/>
     <w:bookmarkEnd w:id="29"/>
-    <w:bookmarkStart w:id="41" w:name="X8bf20a63f0decf7b16e99d564b9958ec4fbbb23"/>
+    <w:bookmarkStart w:id="38" w:name="X8bf20a63f0decf7b16e99d564b9958ec4fbbb23"/>
     <w:p>
       <w:pPr>
         <w:pStyle w:val="Heading2"/>
@@ -720,7 +720,7 @@
     </w:p>
     <w:bookmarkEnd w:id="35"/>
     <w:bookmarkEnd w:id="36"/>
-    <w:bookmarkStart w:id="40" w:name="X120be97a373b91b5bab21d44e9895db7ca01e76"/>
+    <w:bookmarkStart w:id="37" w:name="X120be97a373b91b5bab21d44e9895db7ca01e76"/>
     <w:p>
       <w:pPr>
         <w:pStyle w:val="Heading3"/>
@@ -742,46 +742,7 @@
         <w:pStyle w:val="BodyText"/>
       </w:pPr>
       <w:r>
-        <w:drawing>
-          <wp:inline>
-            <wp:extent cx="5753100" cy="3978568"/>
-            <wp:effectExtent b="0" l="0" r="0" t="0"/>
-            <wp:docPr descr="Figure 1: Conceptual model — TCI and DAI moderating the I–P relationship (Singapore)" title="" id="38" name="Picture"/>
-            <a:graphic>
-              <a:graphicData uri="http://schemas.openxmlformats.org/drawingml/2006/picture">
-                <pic:pic>
-                  <pic:nvPicPr>
-                    <pic:cNvPr descr="figures/p4_singapore/figure_1_conceptual_model.png" id="39" name="Picture"/>
-                    <pic:cNvPicPr>
-                      <a:picLocks noChangeArrowheads="1" noChangeAspect="1"/>
-                    </pic:cNvPicPr>
-                  </pic:nvPicPr>
-                  <pic:blipFill>
-                    <a:blip r:embed="rId37"/>
-                    <a:stretch>
-                      <a:fillRect/>
-                    </a:stretch>
-                  </pic:blipFill>
-                  <pic:spPr bwMode="auto">
-                    <a:xfrm>
-                      <a:off x="0" y="0"/>
-                      <a:ext cx="5753100" cy="3978568"/>
-                    </a:xfrm>
-                    <a:prstGeom prst="rect">
-                      <a:avLst/>
-                    </a:prstGeom>
-                    <a:noFill/>
-                    <a:ln w="9525">
-                      <a:noFill/>
-                      <a:headEnd/>
-                      <a:tailEnd/>
-                    </a:ln>
-                  </pic:spPr>
-                </pic:pic>
-              </a:graphicData>
-            </a:graphic>
-          </wp:inline>
-        </w:drawing>
+        <w:t xml:space="preserve">Figure 1: Conceptual model — TCI and DAI moderating the I–P relationship (Singapore)</w:t>
       </w:r>
     </w:p>
     <w:p>
@@ -820,9 +781,9 @@
         <w:t xml:space="preserve">Solid arrows represent hypothesised direct effects; dashed arrows represent moderating and conditional effects. The independent variable — internationalisation intensity (FSTS, FSTS²_c) — is placed at left; the dependent variable — ln(labour productivity) — is placed at right. H1 (inverted-U tendency with support-constrained turning point ~88.6% FSTS, bootstrap CI [53%, 253%]) is grounded in coordination-cost theory (Hitt et al., 1997); the right-side decline is not formally identified within the observed FSTS range — a theoretically informative result under the saturation framework (Lind–Mehlum p = .303). H1-TCI: technological capability (TCI_z, RBV: Barney, 1991) enters as a direct level-shift to firm performance. H2: DAI (Tier-1+2: website + e-payment) exhibits a non-uniform positive direct effect, varying across export intensity. H3: DAI amplifies I→P performance returns at high FSTS — the primary contingency hypothesis (coordination platform mechanism: Stallkamp &amp; Schotter, 2021; Dynamic Capabilities: Teece, 2007). The Heckman two-step IMR sensitivity check controls exporter selection bias but is not displayed in the figure. (+) denotes positive association. Control variables (ln firm size, age, foreign ownership, sector FE) are included in all empirical models. Note: H3 amplification test conducted on exporters-only subsample (n ≈ 84; power ≈ 16% — corroborating signal, not independent identification). ICRV context: Singapore — Advanced I. Data: WBES 2023; N = 623.</w:t>
       </w:r>
     </w:p>
-    <w:bookmarkEnd w:id="40"/>
-    <w:bookmarkEnd w:id="41"/>
-    <w:bookmarkStart w:id="50" w:name="X167a2da0345881bf36eef0606d50b1063a572d3"/>
+    <w:bookmarkEnd w:id="37"/>
+    <w:bookmarkEnd w:id="38"/>
+    <w:bookmarkStart w:id="47" w:name="X167a2da0345881bf36eef0606d50b1063a572d3"/>
     <w:p>
       <w:pPr>
         <w:pStyle w:val="Heading2"/>
@@ -831,7 +792,7 @@
         <w:t xml:space="preserve">3 Methods</w:t>
       </w:r>
     </w:p>
-    <w:bookmarkStart w:id="42" w:name="X7539fb3dc2f98232f41138bc75cab658563f4ee"/>
+    <w:bookmarkStart w:id="39" w:name="X7539fb3dc2f98232f41138bc75cab658563f4ee"/>
     <w:p>
       <w:pPr>
         <w:pStyle w:val="Heading3"/>
@@ -866,8 +827,8 @@
         <w:t xml:space="preserve">The Singapore DAI distribution reveals high saturation: website presence is reported by approximately 67% of firms, and Tier-2 e-payment adoption (customer- and supplier-side) is widespread relative to less digitally mature institutional settings. This saturation pattern at the advanced-economy ceiling of the digital-infrastructure spectrum has two empirically relevant implications. First, the near-universal diffusion of Tier-1 digital presence removes the discriminatory power that the website indicator alone could carry in less digitally mature settings, so the empirical signal must be drawn from the Tier-2 transaction-enabling layer (e-payment intensity on both customer and supplier sides) to identify the conditional-scaling mechanism — a measurement implication that is borne out in the §4.5 R1 robustness diagnostic, where reducing DAI to Tier-1 alone substantially weakens the quadratic interaction. Second, in transitional-economy settings where Tier-1 digital adoption has diffused widely while Tier-2 transaction-enabling infrastructure remains institutionally bounded, the same construct measured at Tier-1 only would not be expected to produce a comparable positive quadratic interaction; instead it would be more plausibly read as construct-tier obsolescence than as evidence on the conditional-scaling mechanism (see §5.1 for the construct-boundary discussion). The Lind–Mehlum equivalence test result (p = .303) reported in §4.2 should therefore be interpreted in conjunction with the Tier-1+2 construct composition and the high domestic-orientation distribution of the Singapore sample, not as a stand-alone null on the inverted-U logic. Figure 3 [see Figures section] illustrates the predicted I–P curve and the sparse upper-tail region where the turning point is implied.</w:t>
       </w:r>
     </w:p>
-    <w:bookmarkEnd w:id="42"/>
-    <w:bookmarkStart w:id="47" w:name="Xbcf9f12e79107fa2c089aaf13fc6c4fb773f1c2"/>
+    <w:bookmarkEnd w:id="39"/>
+    <w:bookmarkStart w:id="44" w:name="Xbcf9f12e79107fa2c089aaf13fc6c4fb773f1c2"/>
     <w:p>
       <w:pPr>
         <w:pStyle w:val="Heading3"/>
@@ -876,7 +837,7 @@
         <w:t xml:space="preserve">3.2 Variables</w:t>
       </w:r>
     </w:p>
-    <w:bookmarkStart w:id="43" w:name="X7e58563e31c3ad002492190dd8d5308423faaad"/>
+    <w:bookmarkStart w:id="40" w:name="X7e58563e31c3ad002492190dd8d5308423faaad"/>
     <w:p>
       <w:pPr>
         <w:pStyle w:val="Heading4"/>
@@ -893,8 +854,8 @@
         <w:t xml:space="preserve">Firm performance is operationalized as labour productivity, measured as the natural logarithm of annual sales divided by the number of full-time employees. This measure is constructed from WBES annual sales and employment items and follows the productivity-as-performance approach used in prior firm-level international business research. Because all firms belong to the same 2023 cross-section, sales are expressed in nominal 2023 Singapore dollars, with any common price-level effect absorbed by the intercept. To reduce sensitivity to outliers, the dependent variable is winsorized at the 1st and 99th percentiles.</w:t>
       </w:r>
     </w:p>
-    <w:bookmarkEnd w:id="43"/>
-    <w:bookmarkStart w:id="44" w:name="X2cdc78afcfd9a4441a0b7b899a2b559f49a455a"/>
+    <w:bookmarkEnd w:id="40"/>
+    <w:bookmarkStart w:id="41" w:name="X2cdc78afcfd9a4441a0b7b899a2b559f49a455a"/>
     <w:p>
       <w:pPr>
         <w:pStyle w:val="Heading4"/>
@@ -911,8 +872,8 @@
         <w:t xml:space="preserve">The focal internationalization variable is FSTS, defined as the proportion of annual sales derived from direct exports and rescaled to the [0,1] interval. FSTS is mean-centered before squaring in order to mitigate multicollinearity between the linear and quadratic terms (Aiken &amp; West 1991). In the final specifications, variance inflation factors remain below 3, indicating that multicollinearity is not a material concern (O’Brien 2007).</w:t>
       </w:r>
     </w:p>
-    <w:bookmarkEnd w:id="44"/>
-    <w:bookmarkStart w:id="45" w:name="X5885cfa65cddf1d15b27f59176f9dbae5a8c10a"/>
+    <w:bookmarkEnd w:id="41"/>
+    <w:bookmarkStart w:id="42" w:name="X5885cfa65cddf1d15b27f59176f9dbae5a8c10a"/>
     <w:p>
       <w:pPr>
         <w:pStyle w:val="Heading4"/>
@@ -971,14 +932,97 @@
         <w:t xml:space="preserve">, PART C) and are consistent with the §1.3 supporting contribution on construct-tier specificity.</w:t>
       </w:r>
     </w:p>
+    <w:bookmarkEnd w:id="42"/>
+    <w:bookmarkStart w:id="43" w:name="X7f318314f3a5164dbb5d2e2bfe8bd11c34b488e"/>
+    <w:p>
+      <w:pPr>
+        <w:pStyle w:val="Heading4"/>
+      </w:pPr>
+      <w:r>
+        <w:t xml:space="preserve">3.2.4 Controls</w:t>
+      </w:r>
+    </w:p>
+    <w:p>
+      <w:pPr>
+        <w:pStyle w:val="FirstParagraph"/>
+      </w:pPr>
+      <w:r>
+        <w:t xml:space="preserve">The models include firm size, firm age, foreign ownership, and broad sector fixed effects as controls. Firm size is measured as the natural logarithm of the number of full-time employees, firm age is calculated from year of establishment, and foreign ownership is coded as an indicator for at least 10% foreign equity. Broad sector indicators distinguish manufacturing, retail, and other services and absorb sector-level heterogeneity in productivity, export propensity, and technology-adoption norms. Manager experience, originally motivated by the upper-echelons framework (Hambrick &amp; Mason 1984) and initially considered as a control, was dropped after variance-inflation diagnostics indicated problematic collinearity with firm size.</w:t>
+      </w:r>
+    </w:p>
+    <w:bookmarkEnd w:id="43"/>
+    <w:bookmarkEnd w:id="44"/>
+    <w:bookmarkStart w:id="45" w:name="X84482d10811f20e2a246857c008316fafc15eb6"/>
+    <w:p>
+      <w:pPr>
+        <w:pStyle w:val="Heading3"/>
+      </w:pPr>
+      <w:r>
+        <w:t xml:space="preserve">3.3 Estimation strategy and identification scope</w:t>
+      </w:r>
+    </w:p>
+    <w:p>
+      <w:pPr>
+        <w:pStyle w:val="FirstParagraph"/>
+      </w:pPr>
+      <w:r>
+        <w:t xml:space="preserve">The empirical analysis uses ordinary least squares with broad sector fixed effects and HC1 heteroskedasticity-robust standard errors throughout. Models are estimated sequentially, beginning with a controls-only specification and then moving to a linear internationalization model, a quadratic full-sample benchmark, direct-effect models for TCI and DAI, and full specifications that incorporate moderation terms. In light of the strong concentration of firms at zero exports, the baseline quadratic specification is interpreted primarily as a descriptive full-sample benchmark rather than as a standalone structural test of the conventional inverted-U logic. This is important because the full-sample polynomial is necessarily influenced by the domestic-versus-exporter split, whereas the theoretical question developed in Sections 1–2 concerns how performance evolves across the continuous export-intensity range. The later specifications therefore focus on whether TCI and DAI exhibit distinct direct and contingent associations, and the interpretation of nonlinear structure is supplemented by extensive–intensive reasoning and support-aware diagnostics rather than inferred from the quadratic fit alone. Accordingly, the analysis does not treat the full-sample polynomial as sufficient evidence of a formally identified inverted-U in the observed data range.</w:t>
+      </w:r>
+      <w:r>
+        <w:t xml:space="preserve"> </w:t>
+      </w:r>
+      <w:r>
+        <w:t xml:space="preserve">ln(LP) = α + β₁·FSTS_c + β₂·FSTS_c² + β₃·TCI + β₄·DAI + β₅·(FSTS_c × DAI) + β₆·(FSTS_c² × DAI) + γ·controls + ε,</w:t>
+      </w:r>
+      <w:r>
+        <w:t xml:space="preserve"> </w:t>
+      </w:r>
+      <w:r>
+        <w:t xml:space="preserve">The full model includes centered FSTS, squared centered FSTS, TCI, DAI, the interaction between FSTS and DAI, and the interaction between squared FSTS and DAI, in addition to the control set. A supplementary specification replaces the DAI interaction block with analogous TCI interaction terms in order to assess whether any TCI moderation is empirically detectable beyond its more stable direct association with productivity. Following the recommendations of Haans et al. (2016) for testing curvilinear relationships in strategy research, the study applies the Lind and Mehlum (2010) test for a U-shaped or inverted-U relationship to assess the quadratic shape formally. To assess whether the DAI interaction block matters jointly, the study reports a joint F-test on the two DAI interaction terms and also interprets effect size using Cohen’s f² (Aguinis et al. 2005; Cohen 1988).</w:t>
+      </w:r>
+    </w:p>
+    <w:p>
+      <w:pPr>
+        <w:pStyle w:val="BodyText"/>
+      </w:pPr>
+      <w:r>
+        <w:rPr>
+          <w:bCs/>
+          <w:b/>
+        </w:rPr>
+        <w:t xml:space="preserve">Identification strategy and choice of OLS as primary specification.</w:t>
+      </w:r>
+      <w:r>
+        <w:t xml:space="preserve"> </w:t>
+      </w:r>
+      <w:r>
+        <w:t xml:space="preserve">Because the single-wave WBES Singapore 2023 design offers no instrument satisfying the exclusion restriction for either export intensity or digital adoption — cross-sectional variation in trade costs, export-promotion eligibility, or broadband-rollout timing is not available within the survey frame — OLS with HC1 robust standard errors is adopted as the primary specification. This choice follows Wolfolds and Siegel (2019), who show that a Heckman two-step correction</w:t>
+      </w:r>
+      <w:r>
+        <w:t xml:space="preserve"> </w:t>
+      </w:r>
+      <w:r>
+        <w:rPr>
+          <w:iCs/>
+          <w:i/>
+        </w:rPr>
+        <w:t xml:space="preserve">without</w:t>
+      </w:r>
+      <w:r>
+        <w:t xml:space="preserve"> </w:t>
+      </w:r>
+      <w:r>
+        <w:t xml:space="preserve">a credible exclusion restriction can produce more biased estimates than the OLS baseline it is intended to correct. A reduced-form inverse-Mills-ratio sensitivity diagnostic for selection at the extensive margin of exporting is reported in §3.4 below for transparency, but is not treated as the primary specification. The associational nature of the OLS estimates is therefore acknowledged upfront, and inferential claims are bounded to within-context associations rather than causal effects.</w:t>
+      </w:r>
+    </w:p>
     <w:bookmarkEnd w:id="45"/>
-    <w:bookmarkStart w:id="46" w:name="X7f318314f3a5164dbb5d2e2bfe8bd11c34b488e"/>
-    <w:p>
-      <w:pPr>
-        <w:pStyle w:val="Heading4"/>
-      </w:pPr>
-      <w:r>
-        <w:t xml:space="preserve">3.2.4 Controls</w:t>
+    <w:bookmarkStart w:id="46" w:name="X4758c326240d97a48e7d79456dba8f6cc5c46be"/>
+    <w:p>
+      <w:pPr>
+        <w:pStyle w:val="Heading3"/>
+      </w:pPr>
+      <w:r>
+        <w:t xml:space="preserve">3.4 Boundary conditions and identification scope</w:t>
       </w:r>
     </w:p>
     <w:p>
@@ -986,249 +1030,166 @@
         <w:pStyle w:val="FirstParagraph"/>
       </w:pPr>
       <w:r>
-        <w:t xml:space="preserve">The models include firm size, firm age, foreign ownership, and broad sector fixed effects as controls. Firm size is measured as the natural logarithm of the number of full-time employees, firm age is calculated from year of establishment, and foreign ownership is coded as an indicator for at least 10% foreign equity. Broad sector indicators distinguish manufacturing, retail, and other services and absorb sector-level heterogeneity in productivity, export propensity, and technology-adoption norms. Manager experience, originally motivated by the upper-echelons framework (Hambrick &amp; Mason 1984) and initially considered as a control, was dropped after variance-inflation diagnostics indicated problematic collinearity with firm size.</w:t>
+        <w:t xml:space="preserve">This subsection consolidates the methodological boundary conditions that constrain the inferential reach of the OLS specification, so that the §4 results can be presented without recurrent caveats and the §5 discussion can focus on substantive interpretation rather than on re-litigating identification concerns. Four boundary conditions are demarcated.</w:t>
+      </w:r>
+    </w:p>
+    <w:p>
+      <w:pPr>
+        <w:pStyle w:val="BodyText"/>
+      </w:pPr>
+      <w:r>
+        <w:rPr>
+          <w:iCs/>
+          <w:i/>
+        </w:rPr>
+        <w:t xml:space="preserve">(i) Sample-support boundary and upper-tail thinness.</w:t>
+      </w:r>
+      <w:r>
+        <w:t xml:space="preserve"> </w:t>
+      </w:r>
+      <w:r>
+        <w:t xml:space="preserve">The analytic sample (N = 623 full, 617 with all controls) is representative of Singapore's SME sector under the WBES sampling frame. Within this frame, 82 % of firms report zero exports, only 18 % report any positive export intensity, and only 3 % exceed 50 % FSTS. The implication for inference is that the curvature parameters in the quadratic FSTS specification are identified primarily through the participation contrast between FSTS = 0 and FSTS &gt; 0, with limited support in the upper tail of export intensity. The fitted turning point near FSTS ≈ 88.6 % falls in a sparsely populated region of the data, and the 95 % bootstrap confidence interval is wide ([53 %, 253 %]) even though an inverted-U shape is recovered in 96.3 % of resamples. The wide confidence interval [53%, 253%] reflects sparse upper-tail support (only 3% of firms exceed 50% FSTS); this is a support-constrained estimate and should be interpreted as indicating saturation rather than as a precise threshold value. The conventional inverted-U interpretation is therefore not formally identified within the supported data range, and the §4 results are interpreted under this support-aware framing.</w:t>
+      </w:r>
+    </w:p>
+    <w:p>
+      <w:pPr>
+        <w:pStyle w:val="BodyText"/>
+      </w:pPr>
+      <w:r>
+        <w:rPr>
+          <w:iCs/>
+          <w:i/>
+        </w:rPr>
+        <w:t xml:space="preserve">(ii) Exporters-only subsample and power-bounded interaction inference.</w:t>
+      </w:r>
+      <w:r>
+        <w:t xml:space="preserve"> </w:t>
+      </w:r>
+      <w:r>
+        <w:t xml:space="preserve">The exporters-only subsample (FSTS &gt; 0, N = 84) is the natural setting in which to read the intensity-margin coordination-cost mechanism, but is substantially underpowered for detecting the small effect-size moderation block (f² ≈ 0.018). At α = .05 with one numerator degree of freedom, achieving 80 % power requires N ≳ 430; power at N = 84 is approximately 16 %. Three inferential bounds therefore apply: (a)</w:t>
+      </w:r>
+      <w:r>
+        <w:t xml:space="preserve"> </w:t>
+      </w:r>
+      <w:r>
+        <w:rPr>
+          <w:iCs/>
+          <w:i/>
+        </w:rPr>
+        <w:t xml:space="preserve">What cannot be concluded</w:t>
+      </w:r>
+      <w:r>
+        <w:t xml:space="preserve">: the intensity-margin DAI mechanism cannot be confirmed in the exporter-only subsample (N = 84, power ≈ 16%) — we are underpowered to detect interaction effects of β &lt; 1.5 standard deviations; (b)</w:t>
+      </w:r>
+      <w:r>
+        <w:t xml:space="preserve"> </w:t>
+      </w:r>
+      <w:r>
+        <w:rPr>
+          <w:iCs/>
+          <w:i/>
+        </w:rPr>
+        <w:t xml:space="preserve">Methodological remedy</w:t>
+      </w:r>
+      <w:r>
+        <w:t xml:space="preserve">: panel data or an exporter oversampling design with N ≥ 300 would enable intensity-margin inference; (c) power requirements for interaction testing follow Leon (2004). Null DAI moderation results in the exporters-only specification therefore should not be interpreted as evidence against the conditional-scaling mechanism; conversely, the positive joint F-test reported in the R5 exporters-only specification (F = 6.32, p = .003, β = +2.821) is a stronger positive signal than the marginal sample size would ordinarily support, and is read here as a high-prior-strength signal consistent with the full-sample amplification mechanism rather than as a stand-alone identifying test.</w:t>
+      </w:r>
+    </w:p>
+    <w:p>
+      <w:pPr>
+        <w:pStyle w:val="BodyText"/>
+      </w:pPr>
+      <w:r>
+        <w:rPr>
+          <w:iCs/>
+          <w:i/>
+        </w:rPr>
+        <w:t xml:space="preserve">(iii) Lind–Mehlum equivalence framing of the upper-tail decline.</w:t>
+      </w:r>
+      <w:r>
+        <w:t xml:space="preserve"> </w:t>
+      </w:r>
+      <w:r>
+        <w:t xml:space="preserve">The Lind–Mehlum (2010) test does not formally reject monotonicity at conventional thresholds (p = .303 in the baseline pooled specification) — but the appropriate reading of this null is not "the inverted-U fails", because the test is conditioned on dense support around the turning point, which the §3.4(i) sample-support boundary establishes is absent here. Read against the saturation hypothesis developed in §1.1, the Lind–Mehlum null is a</w:t>
+      </w:r>
+      <w:r>
+        <w:t xml:space="preserve"> </w:t>
+      </w:r>
+      <w:r>
+        <w:rPr>
+          <w:iCs/>
+          <w:i/>
+        </w:rPr>
+        <w:t xml:space="preserve">theoretically informative absence-of-decline</w:t>
+      </w:r>
+      <w:r>
+        <w:t xml:space="preserve"> </w:t>
+      </w:r>
+      <w:r>
+        <w:t xml:space="preserve">in the right tail: if foundational digital infrastructure is sufficiently mature to absorb the coordination-cost saturation that produces the conventional inverted-U right-side decline, the appropriate empirical signature is precisely the</w:t>
+      </w:r>
+      <w:r>
+        <w:t xml:space="preserve"> </w:t>
+      </w:r>
+      <w:r>
+        <w:rPr>
+          <w:iCs/>
+          <w:i/>
+        </w:rPr>
+        <w:t xml:space="preserve">non-rejection</w:t>
+      </w:r>
+      <w:r>
+        <w:t xml:space="preserve"> </w:t>
+      </w:r>
+      <w:r>
+        <w:t xml:space="preserve">of monotonicity in the upper tail. This equivalence-framed reading is consistent with both the descriptive evidence (the right tail does not slope sharply downward) and the theoretical commitment in §1.1 (Tier-2 digital infrastructure absorbs the coordination-cost mechanism that generates the inverted-U in less digitally mature settings). The Lind–Mehlum p = .303 is therefore a</w:t>
+      </w:r>
+      <w:r>
+        <w:t xml:space="preserve"> </w:t>
+      </w:r>
+      <w:r>
+        <w:rPr>
+          <w:iCs/>
+          <w:i/>
+        </w:rPr>
+        <w:t xml:space="preserve">positive theoretical signal</w:t>
+      </w:r>
+      <w:r>
+        <w:t xml:space="preserve"> </w:t>
+      </w:r>
+      <w:r>
+        <w:t xml:space="preserve">under the saturation framework, not a methodological failure.</w:t>
+      </w:r>
+    </w:p>
+    <w:p>
+      <w:pPr>
+        <w:pStyle w:val="BodyText"/>
+      </w:pPr>
+      <w:r>
+        <w:rPr>
+          <w:iCs/>
+          <w:i/>
+        </w:rPr>
+        <w:t xml:space="preserve">(iv) Heckman selection sensitivity and absence of an exclusion restriction.</w:t>
+      </w:r>
+      <w:r>
+        <w:t xml:space="preserve"> </w:t>
+      </w:r>
+      <w:r>
+        <w:t xml:space="preserve">No instrument satisfying the exclusion restriction for export participation is available in the single-wave WBES Singapore design. A reduced-form sensitivity check estimates a first-stage probit of export participation on observable firm characteristics (age, log size, sector fixed effects, WBES sampling stratum) and adds the resulting inverse Mills ratio (IMR) as a covariate to the M8 specification. The IMR coefficient (β = 0.264, SE = 0.138, t = 1.92, p = .055) is just above the .05 threshold, indicating mild selection at the extensive margin of export participation. The key DAI × FSTS² interaction (H3 amplification) and the TCI coefficient are not materially altered (|Δ| &lt; 0.02 in each case), confirming that the conditional-scaling mechanism is robust to this selection adjustment. Consistent with Wolfolds and Siegel (2019), the OLS estimates are reported as the primary specification with the caveat that selection on unobservables cannot be fully excluded from the single-wave cross-sectional design.</w:t>
+      </w:r>
+    </w:p>
+    <w:p>
+      <w:pPr>
+        <w:pStyle w:val="BodyText"/>
+      </w:pPr>
+      <w:r>
+        <w:t xml:space="preserve">Read together, these four boundary conditions establish that (a) the upper-tail inverted-U decline is not formally identified within the supported data range — but is not expected to be identified, given the saturation framework; (b) the exporters-only specification provides a high-prior-strength corroborating signal rather than an independent identifying test; (c) the Lind–Mehlum null is a theoretically informative positive signal under the saturation hypothesis, not a methodological failure; and (d) the H3 amplification mechanism is robust to the Heckman sensitivity diagnostic. The §4 results below are reported on this consolidated identification scope, and §5 interprets the substantive findings without further re-litigation of these boundary conditions.</w:t>
       </w:r>
     </w:p>
     <w:bookmarkEnd w:id="46"/>
     <w:bookmarkEnd w:id="47"/>
-    <w:bookmarkStart w:id="48" w:name="X84482d10811f20e2a246857c008316fafc15eb6"/>
-    <w:p>
-      <w:pPr>
-        <w:pStyle w:val="Heading3"/>
-      </w:pPr>
-      <w:r>
-        <w:t xml:space="preserve">3.3 Estimation strategy and identification scope</w:t>
-      </w:r>
-    </w:p>
-    <w:p>
-      <w:pPr>
-        <w:pStyle w:val="FirstParagraph"/>
-      </w:pPr>
-      <w:r>
-        <w:t xml:space="preserve">The empirical analysis uses ordinary least squares with broad sector fixed effects and HC1 heteroskedasticity-robust standard errors throughout. Models are estimated sequentially, beginning with a controls-only specification and then moving to a linear internationalization model, a quadratic full-sample benchmark, direct-effect models for TCI and DAI, and full specifications that incorporate moderation terms. In light of the strong concentration of firms at zero exports, the baseline quadratic specification is interpreted primarily as a descriptive full-sample benchmark rather than as a standalone structural test of the conventional inverted-U logic. This is important because the full-sample polynomial is necessarily influenced by the domestic-versus-exporter split, whereas the theoretical question developed in Sections 1–2 concerns how performance evolves across the continuous export-intensity range. The later specifications therefore focus on whether TCI and DAI exhibit distinct direct and contingent associations, and the interpretation of nonlinear structure is supplemented by extensive–intensive reasoning and support-aware diagnostics rather than inferred from the quadratic fit alone. Accordingly, the analysis does not treat the full-sample polynomial as sufficient evidence of a formally identified inverted-U in the observed data range.</w:t>
-      </w:r>
-      <w:r>
-        <w:t xml:space="preserve"> </w:t>
-      </w:r>
-      <w:r>
-        <w:t xml:space="preserve">ln(LP) = α + β₁·FSTS_c + β₂·FSTS_c² + β₃·TCI + β₄·DAI + β₅·(FSTS_c × DAI) + β₆·(FSTS_c² × DAI) + γ·controls + ε,</w:t>
-      </w:r>
-      <w:r>
-        <w:t xml:space="preserve"> </w:t>
-      </w:r>
-      <w:r>
-        <w:t xml:space="preserve">The full model includes centered FSTS, squared centered FSTS, TCI, DAI, the interaction between FSTS and DAI, and the interaction between squared FSTS and DAI, in addition to the control set. A supplementary specification replaces the DAI interaction block with analogous TCI interaction terms in order to assess whether any TCI moderation is empirically detectable beyond its more stable direct association with productivity. Following the recommendations of Haans et al. (2016) for testing curvilinear relationships in strategy research, the study applies the Lind and Mehlum (2010) test for a U-shaped or inverted-U relationship to assess the quadratic shape formally. To assess whether the DAI interaction block matters jointly, the study reports a joint F-test on the two DAI interaction terms and also interprets effect size using Cohen’s f² (Aguinis et al. 2005; Cohen 1988).</w:t>
-      </w:r>
-    </w:p>
-    <w:p>
-      <w:pPr>
-        <w:pStyle w:val="BodyText"/>
-      </w:pPr>
-      <w:r>
-        <w:rPr>
-          <w:bCs/>
-          <w:b/>
-        </w:rPr>
-        <w:t xml:space="preserve">Identification strategy and choice of OLS as primary specification.</w:t>
-      </w:r>
-      <w:r>
-        <w:t xml:space="preserve"> </w:t>
-      </w:r>
-      <w:r>
-        <w:t xml:space="preserve">Because the single-wave WBES Singapore 2023 design offers no instrument satisfying the exclusion restriction for either export intensity or digital adoption — cross-sectional variation in trade costs, export-promotion eligibility, or broadband-rollout timing is not available within the survey frame — OLS with HC1 robust standard errors is adopted as the primary specification. This choice follows Wolfolds and Siegel (2019), who show that a Heckman two-step correction</w:t>
-      </w:r>
-      <w:r>
-        <w:t xml:space="preserve"> </w:t>
-      </w:r>
-      <w:r>
-        <w:rPr>
-          <w:iCs/>
-          <w:i/>
-        </w:rPr>
-        <w:t xml:space="preserve">without</w:t>
-      </w:r>
-      <w:r>
-        <w:t xml:space="preserve"> </w:t>
-      </w:r>
-      <w:r>
-        <w:t xml:space="preserve">a credible exclusion restriction can produce more biased estimates than the OLS baseline it is intended to correct. A reduced-form inverse-Mills-ratio sensitivity diagnostic for selection at the extensive margin of exporting is reported in §3.4 below for transparency, but is not treated as the primary specification. The associational nature of the OLS estimates is therefore acknowledged upfront, and inferential claims are bounded to within-context associations rather than causal effects.</w:t>
-      </w:r>
-    </w:p>
-    <w:bookmarkEnd w:id="48"/>
-    <w:bookmarkStart w:id="49" w:name="X4758c326240d97a48e7d79456dba8f6cc5c46be"/>
-    <w:p>
-      <w:pPr>
-        <w:pStyle w:val="Heading3"/>
-      </w:pPr>
-      <w:r>
-        <w:t xml:space="preserve">3.4 Boundary conditions and identification scope</w:t>
-      </w:r>
-    </w:p>
-    <w:p>
-      <w:pPr>
-        <w:pStyle w:val="FirstParagraph"/>
-      </w:pPr>
-      <w:r>
-        <w:t xml:space="preserve">This subsection consolidates the methodological boundary conditions that constrain the inferential reach of the OLS specification, so that the §4 results can be presented without recurrent caveats and the §5 discussion can focus on substantive interpretation rather than on re-litigating identification concerns. Four boundary conditions are demarcated.</w:t>
-      </w:r>
-    </w:p>
-    <w:p>
-      <w:pPr>
-        <w:pStyle w:val="BodyText"/>
-      </w:pPr>
-      <w:r>
-        <w:rPr>
-          <w:iCs/>
-          <w:i/>
-        </w:rPr>
-        <w:t xml:space="preserve">(i) Sample-support boundary and upper-tail thinness.</w:t>
-      </w:r>
-      <w:r>
-        <w:t xml:space="preserve"> </w:t>
-      </w:r>
-      <w:r>
-        <w:t xml:space="preserve">The analytic sample (N = 623 full, 617 with all controls) is representative of Singapore's SME sector under the WBES sampling frame. Within this frame, 82 % of firms report zero exports, only 18 % report any positive export intensity, and only 3 % exceed 50 % FSTS. The implication for inference is that the curvature parameters in the quadratic FSTS specification are identified primarily through the participation contrast between FSTS = 0 and FSTS &gt; 0, with limited support in the upper tail of export intensity. The fitted turning point near FSTS ≈ 88.6 % falls in a sparsely populated region of the data, and the 95 % bootstrap confidence interval is wide ([53 %, 253 %]) even though an inverted-U shape is recovered in 96.3 % of resamples. The wide confidence interval [53%, 253%] reflects sparse upper-tail support (only 3% of firms exceed 50% FSTS); this is a support-constrained estimate and should be interpreted as indicating saturation rather than as a precise threshold value. The conventional inverted-U interpretation is therefore not formally identified within the supported data range, and the §4 results are interpreted under this support-aware framing.</w:t>
-      </w:r>
-    </w:p>
-    <w:p>
-      <w:pPr>
-        <w:pStyle w:val="BodyText"/>
-      </w:pPr>
-      <w:r>
-        <w:rPr>
-          <w:iCs/>
-          <w:i/>
-        </w:rPr>
-        <w:t xml:space="preserve">(ii) Exporters-only subsample and power-bounded interaction inference.</w:t>
-      </w:r>
-      <w:r>
-        <w:t xml:space="preserve"> </w:t>
-      </w:r>
-      <w:r>
-        <w:t xml:space="preserve">The exporters-only subsample (FSTS &gt; 0, N = 84) is the natural setting in which to read the intensity-margin coordination-cost mechanism, but is substantially underpowered for detecting the small effect-size moderation block (f² ≈ 0.018). At α = .05 with one numerator degree of freedom, achieving 80 % power requires N ≳ 430; power at N = 84 is approximately 16 %. Three inferential bounds therefore apply: (a)</w:t>
-      </w:r>
-      <w:r>
-        <w:t xml:space="preserve"> </w:t>
-      </w:r>
-      <w:r>
-        <w:rPr>
-          <w:iCs/>
-          <w:i/>
-        </w:rPr>
-        <w:t xml:space="preserve">What cannot be concluded</w:t>
-      </w:r>
-      <w:r>
-        <w:t xml:space="preserve">: the intensity-margin DAI mechanism cannot be confirmed in the exporter-only subsample (N = 84, power ≈ 16%) — we are underpowered to detect interaction effects of β &lt; 1.5 standard deviations; (b)</w:t>
-      </w:r>
-      <w:r>
-        <w:t xml:space="preserve"> </w:t>
-      </w:r>
-      <w:r>
-        <w:rPr>
-          <w:iCs/>
-          <w:i/>
-        </w:rPr>
-        <w:t xml:space="preserve">Methodological remedy</w:t>
-      </w:r>
-      <w:r>
-        <w:t xml:space="preserve">: panel data or an exporter oversampling design with N ≥ 300 would enable intensity-margin inference; (c) power requirements for interaction testing follow Leon (2004). Null DAI moderation results in the exporters-only specification therefore should not be interpreted as evidence against the conditional-scaling mechanism; conversely, the positive joint F-test reported in the R5 exporters-only specification (F = 6.32, p = .003, β = +2.821) is a stronger positive signal than the marginal sample size would ordinarily support, and is read here as a high-prior-strength signal consistent with the full-sample amplification mechanism rather than as a stand-alone identifying test.</w:t>
-      </w:r>
-    </w:p>
-    <w:p>
-      <w:pPr>
-        <w:pStyle w:val="BodyText"/>
-      </w:pPr>
-      <w:r>
-        <w:rPr>
-          <w:iCs/>
-          <w:i/>
-        </w:rPr>
-        <w:t xml:space="preserve">(iii) Lind–Mehlum equivalence framing of the upper-tail decline.</w:t>
-      </w:r>
-      <w:r>
-        <w:t xml:space="preserve"> </w:t>
-      </w:r>
-      <w:r>
-        <w:t xml:space="preserve">The Lind–Mehlum (2010) test does not formally reject monotonicity at conventional thresholds (p = .303 in the baseline pooled specification) — but the appropriate reading of this null is not "the inverted-U fails", because the test is conditioned on dense support around the turning point, which the §3.4(i) sample-support boundary establishes is absent here. Read against the saturation hypothesis developed in §1.1, the Lind–Mehlum null is a</w:t>
-      </w:r>
-      <w:r>
-        <w:t xml:space="preserve"> </w:t>
-      </w:r>
-      <w:r>
-        <w:rPr>
-          <w:iCs/>
-          <w:i/>
-        </w:rPr>
-        <w:t xml:space="preserve">theoretically informative absence-of-decline</w:t>
-      </w:r>
-      <w:r>
-        <w:t xml:space="preserve"> </w:t>
-      </w:r>
-      <w:r>
-        <w:t xml:space="preserve">in the right tail: if foundational digital infrastructure is sufficiently mature to absorb the coordination-cost saturation that produces the conventional inverted-U right-side decline, the appropriate empirical signature is precisely the</w:t>
-      </w:r>
-      <w:r>
-        <w:t xml:space="preserve"> </w:t>
-      </w:r>
-      <w:r>
-        <w:rPr>
-          <w:iCs/>
-          <w:i/>
-        </w:rPr>
-        <w:t xml:space="preserve">non-rejection</w:t>
-      </w:r>
-      <w:r>
-        <w:t xml:space="preserve"> </w:t>
-      </w:r>
-      <w:r>
-        <w:t xml:space="preserve">of monotonicity in the upper tail. This equivalence-framed reading is consistent with both the descriptive evidence (the right tail does not slope sharply downward) and the theoretical commitment in §1.1 (Tier-2 digital infrastructure absorbs the coordination-cost mechanism that generates the inverted-U in less digitally mature settings). The Lind–Mehlum p = .303 is therefore a</w:t>
-      </w:r>
-      <w:r>
-        <w:t xml:space="preserve"> </w:t>
-      </w:r>
-      <w:r>
-        <w:rPr>
-          <w:iCs/>
-          <w:i/>
-        </w:rPr>
-        <w:t xml:space="preserve">positive theoretical signal</w:t>
-      </w:r>
-      <w:r>
-        <w:t xml:space="preserve"> </w:t>
-      </w:r>
-      <w:r>
-        <w:t xml:space="preserve">under the saturation framework, not a methodological failure.</w:t>
-      </w:r>
-    </w:p>
-    <w:p>
-      <w:pPr>
-        <w:pStyle w:val="BodyText"/>
-      </w:pPr>
-      <w:r>
-        <w:rPr>
-          <w:iCs/>
-          <w:i/>
-        </w:rPr>
-        <w:t xml:space="preserve">(iv) Heckman selection sensitivity and absence of an exclusion restriction.</w:t>
-      </w:r>
-      <w:r>
-        <w:t xml:space="preserve"> </w:t>
-      </w:r>
-      <w:r>
-        <w:t xml:space="preserve">No instrument satisfying the exclusion restriction for export participation is available in the single-wave WBES Singapore design. A reduced-form sensitivity check estimates a first-stage probit of export participation on observable firm characteristics (age, log size, sector fixed effects, WBES sampling stratum) and adds the resulting inverse Mills ratio (IMR) as a covariate to the M8 specification. The IMR coefficient (β = 0.264, SE = 0.138, t = 1.92, p = .055) is just above the .05 threshold, indicating mild selection at the extensive margin of export participation. The key DAI × FSTS² interaction (H3 amplification) and the TCI coefficient are not materially altered (|Δ| &lt; 0.02 in each case), confirming that the conditional-scaling mechanism is robust to this selection adjustment. Consistent with Wolfolds and Siegel (2019), the OLS estimates are reported as the primary specification with the caveat that selection on unobservables cannot be fully excluded from the single-wave cross-sectional design.</w:t>
-      </w:r>
-    </w:p>
-    <w:p>
-      <w:pPr>
-        <w:pStyle w:val="BodyText"/>
-      </w:pPr>
-      <w:r>
-        <w:t xml:space="preserve">Read together, these four boundary conditions establish that (a) the upper-tail inverted-U decline is not formally identified within the supported data range — but is not expected to be identified, given the saturation framework; (b) the exporters-only specification provides a high-prior-strength corroborating signal rather than an independent identifying test; (c) the Lind–Mehlum null is a theoretically informative positive signal under the saturation hypothesis, not a methodological failure; and (d) the H3 amplification mechanism is robust to the Heckman sensitivity diagnostic. The §4 results below are reported on this consolidated identification scope, and §5 interprets the substantive findings without further re-litigation of these boundary conditions.</w:t>
-      </w:r>
-    </w:p>
-    <w:bookmarkEnd w:id="49"/>
-    <w:bookmarkEnd w:id="50"/>
-    <w:bookmarkStart w:id="62" w:name="X121719332867ee227f0a04b486098cee978c6e6"/>
+    <w:bookmarkStart w:id="53" w:name="X121719332867ee227f0a04b486098cee978c6e6"/>
     <w:p>
       <w:pPr>
         <w:pStyle w:val="Heading2"/>
@@ -1237,7 +1198,7 @@
         <w:t xml:space="preserve">4 Results</w:t>
       </w:r>
     </w:p>
-    <w:bookmarkStart w:id="51" w:name="Xcfcbc1028680fbd618b9b585dd17cf608861803"/>
+    <w:bookmarkStart w:id="48" w:name="Xcfcbc1028680fbd618b9b585dd17cf608861803"/>
     <w:p>
       <w:pPr>
         <w:pStyle w:val="Heading3"/>
@@ -1548,8 +1509,8 @@
         <w:t xml:space="preserve">Notes: N = 623. TCI and DAI are z-standardized formative composites. FSTS is the share of annual sales accounted for by direct exports. Two-tailed significance levels are reported as follows: p &lt; .10, p &lt; .05, p &lt; .01.</w:t>
       </w:r>
     </w:p>
-    <w:bookmarkEnd w:id="51"/>
-    <w:bookmarkStart w:id="52" w:name="Xe86cbbe4620ce5d84f78b7737e30408048ed6af"/>
+    <w:bookmarkEnd w:id="48"/>
+    <w:bookmarkStart w:id="49" w:name="Xe86cbbe4620ce5d84f78b7737e30408048ed6af"/>
     <w:p>
       <w:pPr>
         <w:pStyle w:val="Heading3"/>
@@ -1579,8 +1540,8 @@
         <w:t xml:space="preserve">. The most defensible interpretation is therefore not that the inverted-U is firmly established, but that the full-sample relationship is predominantly positive with mild quadratic curvature over the observed export-intensity range. In this sense, the quadratic fit is informative descriptively, while stronger claims about a structurally identified right-side decline remain beyond what the present data can support. Read this way, the evidence qualifies rather than overturns the conventional nonlinear literature, while keeping interpretation within the empirical support actually available in the Singapore sample.</w:t>
       </w:r>
     </w:p>
-    <w:bookmarkEnd w:id="52"/>
-    <w:bookmarkStart w:id="53" w:name="Xbd081e7d38ad07e1e46d233e5fbc3c3c47a4f64"/>
+    <w:bookmarkEnd w:id="49"/>
+    <w:bookmarkStart w:id="50" w:name="Xbd081e7d38ad07e1e46d233e5fbc3c3c47a4f64"/>
     <w:p>
       <w:pPr>
         <w:pStyle w:val="Heading3"/>
@@ -1603,8 +1564,8 @@
         <w:t xml:space="preserve">In the supplementary TCI-moderation specification (Model M3), the direct TCI coefficient remains positive and significant (β = 0.188, p &lt; .001), but the interaction terms involving FSTS and squared FSTS are jointly insignificant. Because the absence of moderation cannot be inferred from non-significance alone, the evidence is better read as supporting an intercept-dominant interpretation of the TCI association rather than as a definitive demonstration that curvature moderation is exactly zero. Taken together, the evidence is more consistent with an intercept-dominant reading of the TCI association than with a clearly identified moderation channel in the internationalization–performance relationship. This is also the most coherent reading for hypothesis development, because it preserves the distinction between internal capability depth and export-contingent digital complementarity.</w:t>
       </w:r>
     </w:p>
-    <w:bookmarkEnd w:id="53"/>
-    <w:bookmarkStart w:id="60" w:name="X0bc604979a3b7f5f87ce430a2a9c0e71ddd76f9"/>
+    <w:bookmarkEnd w:id="50"/>
+    <w:bookmarkStart w:id="51" w:name="X0bc604979a3b7f5f87ce430a2a9c0e71ddd76f9"/>
     <w:p>
       <w:pPr>
         <w:pStyle w:val="Heading3"/>
@@ -4229,46 +4190,7 @@
         <w:t xml:space="preserve"> </w:t>
       </w:r>
       <w:r>
-        <w:drawing>
-          <wp:inline>
-            <wp:extent cx="5564514" cy="3588675"/>
-            <wp:effectExtent b="0" l="0" r="0" t="0"/>
-            <wp:docPr descr="Figure 2: Marginal effects of DAI on log labour productivity at varying FSTS levels (Singapore, N=617)" title="" id="55" name="Picture"/>
-            <a:graphic>
-              <a:graphicData uri="http://schemas.openxmlformats.org/drawingml/2006/picture">
-                <pic:pic>
-                  <pic:nvPicPr>
-                    <pic:cNvPr descr="figures/p4_singapore/figure_2_dai_marginal_effect.png" id="56" name="Picture"/>
-                    <pic:cNvPicPr>
-                      <a:picLocks noChangeArrowheads="1" noChangeAspect="1"/>
-                    </pic:cNvPicPr>
-                  </pic:nvPicPr>
-                  <pic:blipFill>
-                    <a:blip r:embed="rId54"/>
-                    <a:stretch>
-                      <a:fillRect/>
-                    </a:stretch>
-                  </pic:blipFill>
-                  <pic:spPr bwMode="auto">
-                    <a:xfrm>
-                      <a:off x="0" y="0"/>
-                      <a:ext cx="5564514" cy="3588675"/>
-                    </a:xfrm>
-                    <a:prstGeom prst="rect">
-                      <a:avLst/>
-                    </a:prstGeom>
-                    <a:noFill/>
-                    <a:ln w="9525">
-                      <a:noFill/>
-                      <a:headEnd/>
-                      <a:tailEnd/>
-                    </a:ln>
-                  </pic:spPr>
-                </pic:pic>
-              </a:graphicData>
-            </a:graphic>
-          </wp:inline>
-        </w:drawing>
+        <w:t xml:space="preserve">Figure 2: Marginal effects of DAI on log labour productivity at varying FSTS levels (Singapore, N=617)</w:t>
       </w:r>
     </w:p>
     <w:p>
@@ -4292,46 +4214,7 @@
         <w:t xml:space="preserve"> </w:t>
       </w:r>
       <w:r>
-        <w:drawing>
-          <wp:inline>
-            <wp:extent cx="5422070" cy="3593270"/>
-            <wp:effectExtent b="0" l="0" r="0" t="0"/>
-            <wp:docPr descr="Figure 3: Predicted I–P curve with bootstrap confidence band (Singapore, OLS M2)" title="" id="58" name="Picture"/>
-            <a:graphic>
-              <a:graphicData uri="http://schemas.openxmlformats.org/drawingml/2006/picture">
-                <pic:pic>
-                  <pic:nvPicPr>
-                    <pic:cNvPr descr="figures/p4_singapore/figure_3_predicted_ip_curve.png" id="59" name="Picture"/>
-                    <pic:cNvPicPr>
-                      <a:picLocks noChangeArrowheads="1" noChangeAspect="1"/>
-                    </pic:cNvPicPr>
-                  </pic:nvPicPr>
-                  <pic:blipFill>
-                    <a:blip r:embed="rId57"/>
-                    <a:stretch>
-                      <a:fillRect/>
-                    </a:stretch>
-                  </pic:blipFill>
-                  <pic:spPr bwMode="auto">
-                    <a:xfrm>
-                      <a:off x="0" y="0"/>
-                      <a:ext cx="5422070" cy="3593270"/>
-                    </a:xfrm>
-                    <a:prstGeom prst="rect">
-                      <a:avLst/>
-                    </a:prstGeom>
-                    <a:noFill/>
-                    <a:ln w="9525">
-                      <a:noFill/>
-                      <a:headEnd/>
-                      <a:tailEnd/>
-                    </a:ln>
-                  </pic:spPr>
-                </pic:pic>
-              </a:graphicData>
-            </a:graphic>
-          </wp:inline>
-        </w:drawing>
+        <w:t xml:space="preserve">Figure 3: Predicted I–P curve with bootstrap confidence band (Singapore, OLS M2)</w:t>
       </w:r>
     </w:p>
     <w:p>
@@ -4358,8 +4241,8 @@
         <w:t xml:space="preserve">Figure 3 visualizes the baseline quadratic fit between export intensity and labour productivity. The fitted curve implies a turning point near FSTS = 88.6% on the original scale (corrected per reviewer fix #3: −β₁/2β₂ applied to mean-centered FSTS ≈ 84.1%; +sample mean 0.045 ≈ 88.6%), but the point estimate is loosely identified — its 95% percentile bootstrap confidence interval spans [53%, 253%] — and lies in a sparsely populated upper tail of the sample. The Lind–Mehlum test does not formally confirm a conventional inverted-U at conventional significance levels. The appropriate interpretation is therefore not that the classic nonlinear literature is overturned, but that in this Singapore sample the right-side decline of the curve appears attenuated or shifted beyond the export range occupied by most firms in the data.</w:t>
       </w:r>
     </w:p>
-    <w:bookmarkEnd w:id="60"/>
-    <w:bookmarkStart w:id="61" w:name="Xc8e997e14555d7ba8da5c1d596c5311617447cd"/>
+    <w:bookmarkEnd w:id="51"/>
+    <w:bookmarkStart w:id="52" w:name="Xc8e997e14555d7ba8da5c1d596c5311617447cd"/>
     <w:p>
       <w:pPr>
         <w:pStyle w:val="Heading3"/>
@@ -5011,9 +4894,9 @@
         <w:t xml:space="preserve">Table 3 evaluates whether the core inference is sensitive to measurement choice and sample composition. Across all reported robustness specifications, the quadratic DAI moderation term retains a positive sign, which strengthens confidence that the main result is not driven by a single operational decision. At the same time, the weakening of statistical significance in the thinner website-only specification suggests that the richer DAI baseline draws meaningful explanatory variation from the electronic-payment indicators in addition to simple digital presence. The exporters-only subsample is less stable because the number of exporting firms is limited and the right tail of export intensity remains thin, so these estimates should be interpreted cautiously. Taken together, the robustness results support the argument that foundational digital adoption acts as a contingent scaling complement, while also reinforcing that the evidence is strongest when interpreted within the Tier 1–2 measurement boundary of the DAI construct.</w:t>
       </w:r>
     </w:p>
-    <w:bookmarkEnd w:id="61"/>
-    <w:bookmarkEnd w:id="62"/>
-    <w:bookmarkStart w:id="65" w:name="X735612638e4e736e4693e459c258977262c0dfc"/>
+    <w:bookmarkEnd w:id="52"/>
+    <w:bookmarkEnd w:id="53"/>
+    <w:bookmarkStart w:id="56" w:name="X735612638e4e736e4693e459c258977262c0dfc"/>
     <w:p>
       <w:pPr>
         <w:pStyle w:val="Heading2"/>
@@ -5022,7 +4905,7 @@
         <w:t xml:space="preserve">5 Discussion</w:t>
       </w:r>
     </w:p>
-    <w:bookmarkStart w:id="63" w:name="X027b31c2d090a00917aa7291770680fd40b64cd"/>
+    <w:bookmarkStart w:id="54" w:name="X027b31c2d090a00917aa7291770680fd40b64cd"/>
     <w:p>
       <w:pPr>
         <w:pStyle w:val="Heading3"/>
@@ -5159,8 +5042,8 @@
         <w:t xml:space="preserve">The institutional transferability of the amplification finding rests on a construct-tier distinction with direct policy implications. In Singapore, the DAI composite captures Tier-1+2 digital capability — website presence (c22b) combined with electronic payment integration (k33/k38) embedded in the public digital infrastructure — enabling firms to execute frictionless cross-border transactions. In contrast, in transitional economies where Tier-2 payment infrastructure remains institutionally bounded — settings where cross-border electronic-payment rails reached systemic scale only in the late 2010s, as documented across lower-middle-income Asia in World Bank digital infrastructure assessments (World Bank, 2023) — the WBES website indicator captures Tier-1 presence only, and the amplification mechanism loses empirical legibility because the payment-integration channel is absent. The implication is that the amplification ceiling is not a Singapore-specific idiosyncrasy but a Tier-1+2 threshold effect: economies that upgrade payment infrastructure to Tier-2 coverage should expect the conditional complementarity pattern to become empirically detectable. This reframes Singapore from an outlier case to a leading indicator of where Tier-2 adoption leads.</w:t>
       </w:r>
     </w:p>
-    <w:bookmarkEnd w:id="63"/>
-    <w:bookmarkStart w:id="64" w:name="Xa4e692b259d9b803bab54ad026a7e8d888a5d2c"/>
+    <w:bookmarkEnd w:id="54"/>
+    <w:bookmarkStart w:id="55" w:name="Xa4e692b259d9b803bab54ad026a7e8d888a5d2c"/>
     <w:p>
       <w:pPr>
         <w:pStyle w:val="Heading3"/>
@@ -5189,9 +5072,9 @@
         <w:t xml:space="preserve">More broadly, the findings imply that managers should avoid treating technological capability and digital adoption as interchangeable investment categories. Investments in technological capability appear to support a broader productivity base, whereas investments in foundational digital adoption become more relevant when firms face the coordination intensity associated with deeper internationalization. This suggests that capability-building and digitalization strategies should be sequenced and matched to the firm’s actual stage of export expansion rather than pursued as a single undifferentiated digital-capability agenda.</w:t>
       </w:r>
     </w:p>
-    <w:bookmarkEnd w:id="64"/>
-    <w:bookmarkEnd w:id="65"/>
-    <w:bookmarkStart w:id="66" w:name="X6b297cc947e0db5526be369b1f0f4ddc67b2415"/>
+    <w:bookmarkEnd w:id="55"/>
+    <w:bookmarkEnd w:id="56"/>
+    <w:bookmarkStart w:id="57" w:name="X6b297cc947e0db5526be369b1f0f4ddc67b2415"/>
     <w:p>
       <w:pPr>
         <w:pStyle w:val="Heading2"/>
@@ -5220,8 +5103,8 @@
         <w:t xml:space="preserve">More broadly, the study contributes to international business research by sharpening construct interpretation and by showing that technological capability and foundational digital adoption are associated with performance through different empirical patterns. Technological capability shows the more stable positive association with productivity, whereas foundational digital adoption is better interpreted as a conditional scaling resource whose relevance becomes more visible only where cross-border coordination demands are relatively intense. These conclusions are deliberately bounded to the present design and setting, and they point toward the need for comparative and longitudinal research before broader cross-setting claims about how digitalization shapes the I–P pattern can be sustained.</w:t>
       </w:r>
     </w:p>
-    <w:bookmarkEnd w:id="66"/>
-    <w:bookmarkStart w:id="67" w:name="X422fdd10c3908fe492ea939b97371c73422dbba"/>
+    <w:bookmarkEnd w:id="57"/>
+    <w:bookmarkStart w:id="58" w:name="X422fdd10c3908fe492ea939b97371c73422dbba"/>
     <w:p>
       <w:pPr>
         <w:pStyle w:val="Heading2"/>
@@ -5250,8 +5133,8 @@
         <w:t xml:space="preserve">Third, the estimated digital-adoption effect should be interpreted within the measurement boundary of the available indicators. The DAI construct captures Tier 1–2 digital adoption — digital presence and electronic-transaction usage — rather than deeper digitally integrated organizational capability or digital dynamic capability; indicator-sensitivity analysis shows that the moderation pattern depends on the foundational digital-infrastructure indicators and weakens when those specific items are dropped. Future research should therefore examine whether the same conditional pattern appears in other digitally advanced economies and under richer measures that capture process integration, organizational digitalization, and higher-order digital capabilities more directly. Panel data, successive enterprise-survey waves, linked administrative records, and stronger quasi-experimental designs — including instrumental-variable or difference-in-differences specifications keyed to digital-infrastructure rollouts or trade-policy shocks — would also help clarify whether the observed associations reflect scaling complementarities, selection effects, or other mechanisms. Concrete instrumental-variable strategies could exploit firm-to-port distance or local customs-clearance times as instruments for export intensity, and regional broadband-coverage shares or within-sector peer-adoption rates as instruments for foundational digital adoption, although Wolfolds and Siegel (2019) caution that such designs require both adequate first-stage strength and credible exclusion restrictions before they can deliver clean causal identification.</w:t>
       </w:r>
     </w:p>
-    <w:bookmarkEnd w:id="67"/>
-    <w:bookmarkStart w:id="69" w:name="data-availability-statement"/>
+    <w:bookmarkEnd w:id="58"/>
+    <w:bookmarkStart w:id="60" w:name="data-availability-statement"/>
     <w:p>
       <w:pPr>
         <w:pStyle w:val="Heading2"/>
@@ -5270,7 +5153,7 @@
       <w:r>
         <w:t xml:space="preserve"> </w:t>
       </w:r>
-      <w:hyperlink r:id="rId68">
+      <w:hyperlink r:id="rId59">
         <w:r>
           <w:rPr>
             <w:rStyle w:val="Hyperlink"/>
@@ -5282,8 +5165,8 @@
         <w:t xml:space="preserve">. Analysis scripts to replicate the results are available from the corresponding author on reasonable request.</w:t>
       </w:r>
     </w:p>
-    <w:bookmarkEnd w:id="69"/>
-    <w:bookmarkStart w:id="70" w:name="acknowledgements"/>
+    <w:bookmarkEnd w:id="60"/>
+    <w:bookmarkStart w:id="61" w:name="acknowledgements"/>
     <w:p>
       <w:pPr>
         <w:pStyle w:val="Heading2"/>
@@ -5300,8 +5183,8 @@
         <w:t xml:space="preserve">We thank the Enterprise Analysis Unit of the Development Economics Global Indicators Group of the World Bank for the data.</w:t>
       </w:r>
     </w:p>
-    <w:bookmarkEnd w:id="70"/>
-    <w:bookmarkStart w:id="71" w:name="funding"/>
+    <w:bookmarkEnd w:id="61"/>
+    <w:bookmarkStart w:id="62" w:name="funding"/>
     <w:p>
       <w:pPr>
         <w:pStyle w:val="Heading2"/>
@@ -5318,8 +5201,8 @@
         <w:t xml:space="preserve">This research received no external funding.</w:t>
       </w:r>
     </w:p>
-    <w:bookmarkEnd w:id="71"/>
-    <w:bookmarkStart w:id="72" w:name="conflict-of-interest"/>
+    <w:bookmarkEnd w:id="62"/>
+    <w:bookmarkStart w:id="63" w:name="conflict-of-interest"/>
     <w:p>
       <w:pPr>
         <w:pStyle w:val="Heading2"/>
@@ -5336,8 +5219,8 @@
         <w:t xml:space="preserve">The authors declare no conflicts of interest.</w:t>
       </w:r>
     </w:p>
-    <w:bookmarkEnd w:id="72"/>
-    <w:bookmarkStart w:id="74" w:name="ai-and-data-availability"/>
+    <w:bookmarkEnd w:id="63"/>
+    <w:bookmarkStart w:id="65" w:name="ai-and-data-availability"/>
     <w:p>
       <w:pPr>
         <w:pStyle w:val="Heading2"/>
@@ -5378,7 +5261,7 @@
       <w:r>
         <w:t xml:space="preserve"> </w:t>
       </w:r>
-      <w:hyperlink r:id="rId73">
+      <w:hyperlink r:id="rId64">
         <w:r>
           <w:rPr>
             <w:rStyle w:val="Hyperlink"/>
@@ -5397,8 +5280,8 @@
         </w:pict>
       </w:r>
     </w:p>
-    <w:bookmarkEnd w:id="74"/>
-    <w:bookmarkStart w:id="110" w:name="references"/>
+    <w:bookmarkEnd w:id="65"/>
+    <w:bookmarkStart w:id="101" w:name="references"/>
     <w:p>
       <w:pPr>
         <w:pStyle w:val="Heading2"/>
@@ -5422,20 +5305,7 @@
           <w:iCs/>
           <w:i/>
         </w:rPr>
-        <w:t xml:space="preserve">Journal of Applied Psychology</w:t>
-      </w:r>
-      <w:r>
-        <w:t xml:space="preserve">,</w:t>
-      </w:r>
-      <w:r>
-        <w:t xml:space="preserve"> </w:t>
-      </w:r>
-      <w:r>
-        <w:rPr>
-          <w:iCs/>
-          <w:i/>
-        </w:rPr>
-        <w:t xml:space="preserve">90</w:t>
+        <w:t xml:space="preserve">Journal of Applied Psychology, 90</w:t>
       </w:r>
       <w:r>
         <w:t xml:space="preserve">(1), 94–107.</w:t>
@@ -5443,7 +5313,7 @@
       <w:r>
         <w:t xml:space="preserve"> </w:t>
       </w:r>
-      <w:hyperlink r:id="rId75">
+      <w:hyperlink r:id="rId66">
         <w:r>
           <w:rPr>
             <w:rStyle w:val="Hyperlink"/>
@@ -5484,20 +5354,7 @@
           <w:iCs/>
           <w:i/>
         </w:rPr>
-        <w:t xml:space="preserve">The Leadership Quarterly</w:t>
-      </w:r>
-      <w:r>
-        <w:t xml:space="preserve">,</w:t>
-      </w:r>
-      <w:r>
-        <w:t xml:space="preserve"> </w:t>
-      </w:r>
-      <w:r>
-        <w:rPr>
-          <w:iCs/>
-          <w:i/>
-        </w:rPr>
-        <w:t xml:space="preserve">21</w:t>
+        <w:t xml:space="preserve">The Leadership Quarterly, 21</w:t>
       </w:r>
       <w:r>
         <w:t xml:space="preserve">(6), 1086–1120.</w:t>
@@ -5505,7 +5362,7 @@
       <w:r>
         <w:t xml:space="preserve"> </w:t>
       </w:r>
-      <w:hyperlink r:id="rId76">
+      <w:hyperlink r:id="rId67">
         <w:r>
           <w:rPr>
             <w:rStyle w:val="Hyperlink"/>
@@ -5527,20 +5384,7 @@
           <w:iCs/>
           <w:i/>
         </w:rPr>
-        <w:t xml:space="preserve">The European Journal of Development Research</w:t>
-      </w:r>
-      <w:r>
-        <w:t xml:space="preserve">,</w:t>
-      </w:r>
-      <w:r>
-        <w:t xml:space="preserve"> </w:t>
-      </w:r>
-      <w:r>
-        <w:rPr>
-          <w:iCs/>
-          <w:i/>
-        </w:rPr>
-        <w:t xml:space="preserve">33</w:t>
+        <w:t xml:space="preserve">The European Journal of Development Research, 33</w:t>
       </w:r>
       <w:r>
         <w:t xml:space="preserve">(2), 304–329.</w:t>
@@ -5548,7 +5392,7 @@
       <w:r>
         <w:t xml:space="preserve"> </w:t>
       </w:r>
-      <w:hyperlink r:id="rId77">
+      <w:hyperlink r:id="rId68">
         <w:r>
           <w:rPr>
             <w:rStyle w:val="Hyperlink"/>
@@ -5570,20 +5414,7 @@
           <w:iCs/>
           <w:i/>
         </w:rPr>
-        <w:t xml:space="preserve">Journal of International Business Studies</w:t>
-      </w:r>
-      <w:r>
-        <w:t xml:space="preserve">,</w:t>
-      </w:r>
-      <w:r>
-        <w:t xml:space="preserve"> </w:t>
-      </w:r>
-      <w:r>
-        <w:rPr>
-          <w:iCs/>
-          <w:i/>
-        </w:rPr>
-        <w:t xml:space="preserve">50</w:t>
+        <w:t xml:space="preserve">Journal of International Business Studies, 50</w:t>
       </w:r>
       <w:r>
         <w:t xml:space="preserve">(8), 1372–1387.</w:t>
@@ -5591,7 +5422,7 @@
       <w:r>
         <w:t xml:space="preserve"> </w:t>
       </w:r>
-      <w:hyperlink r:id="rId78">
+      <w:hyperlink r:id="rId69">
         <w:r>
           <w:rPr>
             <w:rStyle w:val="Hyperlink"/>
@@ -5613,20 +5444,7 @@
           <w:iCs/>
           <w:i/>
         </w:rPr>
-        <w:t xml:space="preserve">Journal of Management</w:t>
-      </w:r>
-      <w:r>
-        <w:t xml:space="preserve">,</w:t>
-      </w:r>
-      <w:r>
-        <w:t xml:space="preserve"> </w:t>
-      </w:r>
-      <w:r>
-        <w:rPr>
-          <w:iCs/>
-          <w:i/>
-        </w:rPr>
-        <w:t xml:space="preserve">17</w:t>
+        <w:t xml:space="preserve">Journal of Management, 17</w:t>
       </w:r>
       <w:r>
         <w:t xml:space="preserve">(1), 99–120.</w:t>
@@ -5634,7 +5452,7 @@
       <w:r>
         <w:t xml:space="preserve"> </w:t>
       </w:r>
-      <w:hyperlink r:id="rId79">
+      <w:hyperlink r:id="rId70">
         <w:r>
           <w:rPr>
             <w:rStyle w:val="Hyperlink"/>
@@ -5656,20 +5474,7 @@
           <w:iCs/>
           <w:i/>
         </w:rPr>
-        <w:t xml:space="preserve">MIS Quarterly</w:t>
-      </w:r>
-      <w:r>
-        <w:t xml:space="preserve">,</w:t>
-      </w:r>
-      <w:r>
-        <w:t xml:space="preserve"> </w:t>
-      </w:r>
-      <w:r>
-        <w:rPr>
-          <w:iCs/>
-          <w:i/>
-        </w:rPr>
-        <w:t xml:space="preserve">37</w:t>
+        <w:t xml:space="preserve">MIS Quarterly, 37</w:t>
       </w:r>
       <w:r>
         <w:t xml:space="preserve">(2), 471–482.</w:t>
@@ -5677,7 +5482,7 @@
       <w:r>
         <w:t xml:space="preserve"> </w:t>
       </w:r>
-      <w:hyperlink r:id="rId80">
+      <w:hyperlink r:id="rId71">
         <w:r>
           <w:rPr>
             <w:rStyle w:val="Hyperlink"/>
@@ -5699,20 +5504,7 @@
           <w:iCs/>
           <w:i/>
         </w:rPr>
-        <w:t xml:space="preserve">American Economic Journal: Macroeconomics</w:t>
-      </w:r>
-      <w:r>
-        <w:t xml:space="preserve">,</w:t>
-      </w:r>
-      <w:r>
-        <w:t xml:space="preserve"> </w:t>
-      </w:r>
-      <w:r>
-        <w:rPr>
-          <w:iCs/>
-          <w:i/>
-        </w:rPr>
-        <w:t xml:space="preserve">13</w:t>
+        <w:t xml:space="preserve">American Economic Journal: Macroeconomics, 13</w:t>
       </w:r>
       <w:r>
         <w:t xml:space="preserve">(1), 333–372.</w:t>
@@ -5720,7 +5512,7 @@
       <w:r>
         <w:t xml:space="preserve"> </w:t>
       </w:r>
-      <w:hyperlink r:id="rId81">
+      <w:hyperlink r:id="rId72">
         <w:r>
           <w:rPr>
             <w:rStyle w:val="Hyperlink"/>
@@ -5764,20 +5556,7 @@
           <w:iCs/>
           <w:i/>
         </w:rPr>
-        <w:t xml:space="preserve">Administrative Science Quarterly</w:t>
-      </w:r>
-      <w:r>
-        <w:t xml:space="preserve">,</w:t>
-      </w:r>
-      <w:r>
-        <w:t xml:space="preserve"> </w:t>
-      </w:r>
-      <w:r>
-        <w:rPr>
-          <w:iCs/>
-          <w:i/>
-        </w:rPr>
-        <w:t xml:space="preserve">35</w:t>
+        <w:t xml:space="preserve">Administrative Science Quarterly, 35</w:t>
       </w:r>
       <w:r>
         <w:t xml:space="preserve">(1), 128–152.</w:t>
@@ -5785,7 +5564,7 @@
       <w:r>
         <w:t xml:space="preserve"> </w:t>
       </w:r>
-      <w:hyperlink r:id="rId82">
+      <w:hyperlink r:id="rId73">
         <w:r>
           <w:rPr>
             <w:rStyle w:val="Hyperlink"/>
@@ -5807,20 +5586,7 @@
           <w:iCs/>
           <w:i/>
         </w:rPr>
-        <w:t xml:space="preserve">Journal of Business Research</w:t>
-      </w:r>
-      <w:r>
-        <w:t xml:space="preserve">,</w:t>
-      </w:r>
-      <w:r>
-        <w:t xml:space="preserve"> </w:t>
-      </w:r>
-      <w:r>
-        <w:rPr>
-          <w:iCs/>
-          <w:i/>
-        </w:rPr>
-        <w:t xml:space="preserve">61</w:t>
+        <w:t xml:space="preserve">Journal of Business Research, 61</w:t>
       </w:r>
       <w:r>
         <w:t xml:space="preserve">(12), 1250–1262.</w:t>
@@ -5828,7 +5594,7 @@
       <w:r>
         <w:t xml:space="preserve"> </w:t>
       </w:r>
-      <w:hyperlink r:id="rId83">
+      <w:hyperlink r:id="rId74">
         <w:r>
           <w:rPr>
             <w:rStyle w:val="Hyperlink"/>
@@ -5850,20 +5616,7 @@
           <w:iCs/>
           <w:i/>
         </w:rPr>
-        <w:t xml:space="preserve">Management International Review</w:t>
-      </w:r>
-      <w:r>
-        <w:t xml:space="preserve">,</w:t>
-      </w:r>
-      <w:r>
-        <w:t xml:space="preserve"> </w:t>
-      </w:r>
-      <w:r>
-        <w:rPr>
-          <w:iCs/>
-          <w:i/>
-        </w:rPr>
-        <w:t xml:space="preserve">47</w:t>
+        <w:t xml:space="preserve">Management International Review, 47</w:t>
       </w:r>
       <w:r>
         <w:t xml:space="preserve">(3), 453–475.</w:t>
@@ -5871,7 +5624,7 @@
       <w:r>
         <w:t xml:space="preserve"> </w:t>
       </w:r>
-      <w:hyperlink r:id="rId84">
+      <w:hyperlink r:id="rId75">
         <w:r>
           <w:rPr>
             <w:rStyle w:val="Hyperlink"/>
@@ -5893,20 +5646,7 @@
           <w:iCs/>
           <w:i/>
         </w:rPr>
-        <w:t xml:space="preserve">Journal of International Business Studies</w:t>
-      </w:r>
-      <w:r>
-        <w:t xml:space="preserve">,</w:t>
-      </w:r>
-      <w:r>
-        <w:t xml:space="preserve"> </w:t>
-      </w:r>
-      <w:r>
-        <w:rPr>
-          <w:iCs/>
-          <w:i/>
-        </w:rPr>
-        <w:t xml:space="preserve">34</w:t>
+        <w:t xml:space="preserve">Journal of International Business Studies, 34</w:t>
       </w:r>
       <w:r>
         <w:t xml:space="preserve">(1), 5–18.</w:t>
@@ -5914,7 +5654,7 @@
       <w:r>
         <w:t xml:space="preserve"> </w:t>
       </w:r>
-      <w:hyperlink r:id="rId85">
+      <w:hyperlink r:id="rId76">
         <w:r>
           <w:rPr>
             <w:rStyle w:val="Hyperlink"/>
@@ -5936,20 +5676,7 @@
           <w:iCs/>
           <w:i/>
         </w:rPr>
-        <w:t xml:space="preserve">Strategic Management Journal</w:t>
-      </w:r>
-      <w:r>
-        <w:t xml:space="preserve">,</w:t>
-      </w:r>
-      <w:r>
-        <w:t xml:space="preserve"> </w:t>
-      </w:r>
-      <w:r>
-        <w:rPr>
-          <w:iCs/>
-          <w:i/>
-        </w:rPr>
-        <w:t xml:space="preserve">37</w:t>
+        <w:t xml:space="preserve">Strategic Management Journal, 37</w:t>
       </w:r>
       <w:r>
         <w:t xml:space="preserve">(7), 1177–1195.</w:t>
@@ -5957,7 +5684,7 @@
       <w:r>
         <w:t xml:space="preserve"> </w:t>
       </w:r>
-      <w:hyperlink r:id="rId86">
+      <w:hyperlink r:id="rId77">
         <w:r>
           <w:rPr>
             <w:rStyle w:val="Hyperlink"/>
@@ -5979,20 +5706,7 @@
           <w:iCs/>
           <w:i/>
         </w:rPr>
-        <w:t xml:space="preserve">Academy of Management Review</w:t>
-      </w:r>
-      <w:r>
-        <w:t xml:space="preserve">,</w:t>
-      </w:r>
-      <w:r>
-        <w:t xml:space="preserve"> </w:t>
-      </w:r>
-      <w:r>
-        <w:rPr>
-          <w:iCs/>
-          <w:i/>
-        </w:rPr>
-        <w:t xml:space="preserve">9</w:t>
+        <w:t xml:space="preserve">Academy of Management Review, 9</w:t>
       </w:r>
       <w:r>
         <w:t xml:space="preserve">(2), 193–206.</w:t>
@@ -6000,7 +5714,7 @@
       <w:r>
         <w:t xml:space="preserve"> </w:t>
       </w:r>
-      <w:hyperlink r:id="rId87">
+      <w:hyperlink r:id="rId78">
         <w:r>
           <w:rPr>
             <w:rStyle w:val="Hyperlink"/>
@@ -6022,20 +5736,7 @@
           <w:iCs/>
           <w:i/>
         </w:rPr>
-        <w:t xml:space="preserve">Academy of Management Journal</w:t>
-      </w:r>
-      <w:r>
-        <w:t xml:space="preserve">,</w:t>
-      </w:r>
-      <w:r>
-        <w:t xml:space="preserve"> </w:t>
-      </w:r>
-      <w:r>
-        <w:rPr>
-          <w:iCs/>
-          <w:i/>
-        </w:rPr>
-        <w:t xml:space="preserve">40</w:t>
+        <w:t xml:space="preserve">Academy of Management Journal, 40</w:t>
       </w:r>
       <w:r>
         <w:t xml:space="preserve">(4), 767–798.</w:t>
@@ -6043,7 +5744,7 @@
       <w:r>
         <w:t xml:space="preserve"> </w:t>
       </w:r>
-      <w:hyperlink r:id="rId88">
+      <w:hyperlink r:id="rId79">
         <w:r>
           <w:rPr>
             <w:rStyle w:val="Hyperlink"/>
@@ -6065,20 +5766,7 @@
           <w:iCs/>
           <w:i/>
         </w:rPr>
-        <w:t xml:space="preserve">International Business Review</w:t>
-      </w:r>
-      <w:r>
-        <w:t xml:space="preserve">,</w:t>
-      </w:r>
-      <w:r>
-        <w:t xml:space="preserve"> </w:t>
-      </w:r>
-      <w:r>
-        <w:rPr>
-          <w:iCs/>
-          <w:i/>
-        </w:rPr>
-        <w:t xml:space="preserve">27</w:t>
+        <w:t xml:space="preserve">International Business Review, 27</w:t>
       </w:r>
       <w:r>
         <w:t xml:space="preserve">(1), 218–230.</w:t>
@@ -6086,7 +5774,7 @@
       <w:r>
         <w:t xml:space="preserve"> </w:t>
       </w:r>
-      <w:hyperlink r:id="rId89">
+      <w:hyperlink r:id="rId80">
         <w:r>
           <w:rPr>
             <w:rStyle w:val="Hyperlink"/>
@@ -6108,20 +5796,7 @@
           <w:iCs/>
           <w:i/>
         </w:rPr>
-        <w:t xml:space="preserve">Advances in Methods and Practices in Psychological Science</w:t>
-      </w:r>
-      <w:r>
-        <w:t xml:space="preserve">,</w:t>
-      </w:r>
-      <w:r>
-        <w:t xml:space="preserve"> </w:t>
-      </w:r>
-      <w:r>
-        <w:rPr>
-          <w:iCs/>
-          <w:i/>
-        </w:rPr>
-        <w:t xml:space="preserve">1</w:t>
+        <w:t xml:space="preserve">Advances in Methods and Practices in Psychological Science, 1</w:t>
       </w:r>
       <w:r>
         <w:t xml:space="preserve">(2), 259–269.</w:t>
@@ -6129,7 +5804,7 @@
       <w:r>
         <w:t xml:space="preserve"> </w:t>
       </w:r>
-      <w:hyperlink r:id="rId90">
+      <w:hyperlink r:id="rId81">
         <w:r>
           <w:rPr>
             <w:rStyle w:val="Hyperlink"/>
@@ -6151,20 +5826,7 @@
           <w:iCs/>
           <w:i/>
         </w:rPr>
-        <w:t xml:space="preserve">World Development</w:t>
-      </w:r>
-      <w:r>
-        <w:t xml:space="preserve">,</w:t>
-      </w:r>
-      <w:r>
-        <w:t xml:space="preserve"> </w:t>
-      </w:r>
-      <w:r>
-        <w:rPr>
-          <w:iCs/>
-          <w:i/>
-        </w:rPr>
-        <w:t xml:space="preserve">20</w:t>
+        <w:t xml:space="preserve">World Development, 20</w:t>
       </w:r>
       <w:r>
         <w:t xml:space="preserve">(2), 165–186.</w:t>
@@ -6172,7 +5834,7 @@
       <w:r>
         <w:t xml:space="preserve"> </w:t>
       </w:r>
-      <w:hyperlink r:id="rId91">
+      <w:hyperlink r:id="rId82">
         <w:r>
           <w:rPr>
             <w:rStyle w:val="Hyperlink"/>
@@ -6194,20 +5856,7 @@
           <w:iCs/>
           <w:i/>
         </w:rPr>
-        <w:t xml:space="preserve">Oxford Bulletin of Economics and Statistics</w:t>
-      </w:r>
-      <w:r>
-        <w:t xml:space="preserve">,</w:t>
-      </w:r>
-      <w:r>
-        <w:t xml:space="preserve"> </w:t>
-      </w:r>
-      <w:r>
-        <w:rPr>
-          <w:iCs/>
-          <w:i/>
-        </w:rPr>
-        <w:t xml:space="preserve">72</w:t>
+        <w:t xml:space="preserve">Oxford Bulletin of Economics and Statistics, 72</w:t>
       </w:r>
       <w:r>
         <w:t xml:space="preserve">(1), 109–118.</w:t>
@@ -6215,7 +5864,7 @@
       <w:r>
         <w:t xml:space="preserve"> </w:t>
       </w:r>
-      <w:hyperlink r:id="rId92">
+      <w:hyperlink r:id="rId83">
         <w:r>
           <w:rPr>
             <w:rStyle w:val="Hyperlink"/>
@@ -6237,20 +5886,7 @@
           <w:iCs/>
           <w:i/>
         </w:rPr>
-        <w:t xml:space="preserve">Academy of Management Journal</w:t>
-      </w:r>
-      <w:r>
-        <w:t xml:space="preserve">,</w:t>
-      </w:r>
-      <w:r>
-        <w:t xml:space="preserve"> </w:t>
-      </w:r>
-      <w:r>
-        <w:rPr>
-          <w:iCs/>
-          <w:i/>
-        </w:rPr>
-        <w:t xml:space="preserve">47</w:t>
+        <w:t xml:space="preserve">Academy of Management Journal, 47</w:t>
       </w:r>
       <w:r>
         <w:t xml:space="preserve">(4), 598–609.</w:t>
@@ -6258,7 +5894,7 @@
       <w:r>
         <w:t xml:space="preserve"> </w:t>
       </w:r>
-      <w:hyperlink r:id="rId93">
+      <w:hyperlink r:id="rId84">
         <w:r>
           <w:rPr>
             <w:rStyle w:val="Hyperlink"/>
@@ -6280,20 +5916,7 @@
           <w:iCs/>
           <w:i/>
         </w:rPr>
-        <w:t xml:space="preserve">Journal of Econometrics</w:t>
-      </w:r>
-      <w:r>
-        <w:t xml:space="preserve">,</w:t>
-      </w:r>
-      <w:r>
-        <w:t xml:space="preserve"> </w:t>
-      </w:r>
-      <w:r>
-        <w:rPr>
-          <w:iCs/>
-          <w:i/>
-        </w:rPr>
-        <w:t xml:space="preserve">29</w:t>
+        <w:t xml:space="preserve">Journal of Econometrics, 29</w:t>
       </w:r>
       <w:r>
         <w:t xml:space="preserve">(3), 305–325.</w:t>
@@ -6301,7 +5924,7 @@
       <w:r>
         <w:t xml:space="preserve"> </w:t>
       </w:r>
-      <w:hyperlink r:id="rId94">
+      <w:hyperlink r:id="rId85">
         <w:r>
           <w:rPr>
             <w:rStyle w:val="Hyperlink"/>
@@ -6323,20 +5946,7 @@
           <w:iCs/>
           <w:i/>
         </w:rPr>
-        <w:t xml:space="preserve">Journal of Management</w:t>
-      </w:r>
-      <w:r>
-        <w:t xml:space="preserve">,</w:t>
-      </w:r>
-      <w:r>
-        <w:t xml:space="preserve"> </w:t>
-      </w:r>
-      <w:r>
-        <w:rPr>
-          <w:iCs/>
-          <w:i/>
-        </w:rPr>
-        <w:t xml:space="preserve">42</w:t>
+        <w:t xml:space="preserve">Journal of Management, 42</w:t>
       </w:r>
       <w:r>
         <w:t xml:space="preserve">(5), 1075–1110.</w:t>
@@ -6344,7 +5954,7 @@
       <w:r>
         <w:t xml:space="preserve"> </w:t>
       </w:r>
-      <w:hyperlink r:id="rId95">
+      <w:hyperlink r:id="rId86">
         <w:r>
           <w:rPr>
             <w:rStyle w:val="Hyperlink"/>
@@ -6366,20 +5976,7 @@
           <w:iCs/>
           <w:i/>
         </w:rPr>
-        <w:t xml:space="preserve">Journal of International Business Studies</w:t>
-      </w:r>
-      <w:r>
-        <w:t xml:space="preserve">,</w:t>
-      </w:r>
-      <w:r>
-        <w:t xml:space="preserve"> </w:t>
-      </w:r>
-      <w:r>
-        <w:rPr>
-          <w:iCs/>
-          <w:i/>
-        </w:rPr>
-        <w:t xml:space="preserve">48</w:t>
+        <w:t xml:space="preserve">Journal of International Business Studies, 48</w:t>
       </w:r>
       <w:r>
         <w:t xml:space="preserve">(5), 535–551.</w:t>
@@ -6387,7 +5984,7 @@
       <w:r>
         <w:t xml:space="preserve"> </w:t>
       </w:r>
-      <w:hyperlink r:id="rId96">
+      <w:hyperlink r:id="rId87">
         <w:r>
           <w:rPr>
             <w:rStyle w:val="Hyperlink"/>
@@ -6409,20 +6006,7 @@
           <w:iCs/>
           <w:i/>
         </w:rPr>
-        <w:t xml:space="preserve">Quality &amp; Quantity</w:t>
-      </w:r>
-      <w:r>
-        <w:t xml:space="preserve">,</w:t>
-      </w:r>
-      <w:r>
-        <w:t xml:space="preserve"> </w:t>
-      </w:r>
-      <w:r>
-        <w:rPr>
-          <w:iCs/>
-          <w:i/>
-        </w:rPr>
-        <w:t xml:space="preserve">41</w:t>
+        <w:t xml:space="preserve">Quality &amp; Quantity, 41</w:t>
       </w:r>
       <w:r>
         <w:t xml:space="preserve">(5), 673–690.</w:t>
@@ -6430,7 +6014,7 @@
       <w:r>
         <w:t xml:space="preserve"> </w:t>
       </w:r>
-      <w:hyperlink r:id="rId97">
+      <w:hyperlink r:id="rId88">
         <w:r>
           <w:rPr>
             <w:rStyle w:val="Hyperlink"/>
@@ -6452,20 +6036,7 @@
           <w:iCs/>
           <w:i/>
         </w:rPr>
-        <w:t xml:space="preserve">Academy of Management Review</w:t>
-      </w:r>
-      <w:r>
-        <w:t xml:space="preserve">,</w:t>
-      </w:r>
-      <w:r>
-        <w:t xml:space="preserve"> </w:t>
-      </w:r>
-      <w:r>
-        <w:rPr>
-          <w:iCs/>
-          <w:i/>
-        </w:rPr>
-        <w:t xml:space="preserve">28</w:t>
+        <w:t xml:space="preserve">Academy of Management Review, 28</w:t>
       </w:r>
       <w:r>
         <w:t xml:space="preserve">(2), 275–296.</w:t>
@@ -6473,7 +6044,7 @@
       <w:r>
         <w:t xml:space="preserve"> </w:t>
       </w:r>
-      <w:hyperlink r:id="rId98">
+      <w:hyperlink r:id="rId89">
         <w:r>
           <w:rPr>
             <w:rStyle w:val="Hyperlink"/>
@@ -6495,20 +6066,7 @@
           <w:iCs/>
           <w:i/>
         </w:rPr>
-        <w:t xml:space="preserve">Journal of International Business Studies</w:t>
-      </w:r>
-      <w:r>
-        <w:t xml:space="preserve">,</w:t>
-      </w:r>
-      <w:r>
-        <w:t xml:space="preserve"> </w:t>
-      </w:r>
-      <w:r>
-        <w:rPr>
-          <w:iCs/>
-          <w:i/>
-        </w:rPr>
-        <w:t xml:space="preserve">39</w:t>
+        <w:t xml:space="preserve">Journal of International Business Studies, 39</w:t>
       </w:r>
       <w:r>
         <w:t xml:space="preserve">(5), 920–936.</w:t>
@@ -6516,7 +6074,7 @@
       <w:r>
         <w:t xml:space="preserve"> </w:t>
       </w:r>
-      <w:hyperlink r:id="rId99">
+      <w:hyperlink r:id="rId90">
         <w:r>
           <w:rPr>
             <w:rStyle w:val="Hyperlink"/>
@@ -6538,20 +6096,7 @@
           <w:iCs/>
           <w:i/>
         </w:rPr>
-        <w:t xml:space="preserve">Journal of International Business Studies</w:t>
-      </w:r>
-      <w:r>
-        <w:t xml:space="preserve">,</w:t>
-      </w:r>
-      <w:r>
-        <w:t xml:space="preserve"> </w:t>
-      </w:r>
-      <w:r>
-        <w:rPr>
-          <w:iCs/>
-          <w:i/>
-        </w:rPr>
-        <w:t xml:space="preserve">35</w:t>
+        <w:t xml:space="preserve">Journal of International Business Studies, 35</w:t>
       </w:r>
       <w:r>
         <w:t xml:space="preserve">(1), 3–18.</w:t>
@@ -6559,7 +6104,7 @@
       <w:r>
         <w:t xml:space="preserve"> </w:t>
       </w:r>
-      <w:hyperlink r:id="rId100">
+      <w:hyperlink r:id="rId91">
         <w:r>
           <w:rPr>
             <w:rStyle w:val="Hyperlink"/>
@@ -6581,20 +6126,7 @@
           <w:iCs/>
           <w:i/>
         </w:rPr>
-        <w:t xml:space="preserve">Journal of Management</w:t>
-      </w:r>
-      <w:r>
-        <w:t xml:space="preserve">,</w:t>
-      </w:r>
-      <w:r>
-        <w:t xml:space="preserve"> </w:t>
-      </w:r>
-      <w:r>
-        <w:rPr>
-          <w:iCs/>
-          <w:i/>
-        </w:rPr>
-        <w:t xml:space="preserve">46</w:t>
+        <w:t xml:space="preserve">Journal of Management, 46</w:t>
       </w:r>
       <w:r>
         <w:t xml:space="preserve">(6), 1244–1256.</w:t>
@@ -6602,7 +6134,7 @@
       <w:r>
         <w:t xml:space="preserve"> </w:t>
       </w:r>
-      <w:hyperlink r:id="rId101">
+      <w:hyperlink r:id="rId92">
         <w:r>
           <w:rPr>
             <w:rStyle w:val="Hyperlink"/>
@@ -6624,20 +6156,7 @@
           <w:iCs/>
           <w:i/>
         </w:rPr>
-        <w:t xml:space="preserve">Global Strategy Journal</w:t>
-      </w:r>
-      <w:r>
-        <w:t xml:space="preserve">,</w:t>
-      </w:r>
-      <w:r>
-        <w:t xml:space="preserve"> </w:t>
-      </w:r>
-      <w:r>
-        <w:rPr>
-          <w:iCs/>
-          <w:i/>
-        </w:rPr>
-        <w:t xml:space="preserve">11</w:t>
+        <w:t xml:space="preserve">Global Strategy Journal, 11</w:t>
       </w:r>
       <w:r>
         <w:t xml:space="preserve">(1), 58–80.</w:t>
@@ -6645,7 +6164,7 @@
       <w:r>
         <w:t xml:space="preserve"> </w:t>
       </w:r>
-      <w:hyperlink r:id="rId102">
+      <w:hyperlink r:id="rId93">
         <w:r>
           <w:rPr>
             <w:rStyle w:val="Hyperlink"/>
@@ -6667,20 +6186,7 @@
           <w:iCs/>
           <w:i/>
         </w:rPr>
-        <w:t xml:space="preserve">Journal of Business Research</w:t>
-      </w:r>
-      <w:r>
-        <w:t xml:space="preserve">,</w:t>
-      </w:r>
-      <w:r>
-        <w:t xml:space="preserve"> </w:t>
-      </w:r>
-      <w:r>
-        <w:rPr>
-          <w:iCs/>
-          <w:i/>
-        </w:rPr>
-        <w:t xml:space="preserve">122</w:t>
+        <w:t xml:space="preserve">Journal of Business Research, 122</w:t>
       </w:r>
       <w:r>
         <w:t xml:space="preserve">, 889–901.</w:t>
@@ -6688,7 +6194,7 @@
       <w:r>
         <w:t xml:space="preserve"> </w:t>
       </w:r>
-      <w:hyperlink r:id="rId103">
+      <w:hyperlink r:id="rId94">
         <w:r>
           <w:rPr>
             <w:rStyle w:val="Hyperlink"/>
@@ -6710,20 +6216,7 @@
           <w:iCs/>
           <w:i/>
         </w:rPr>
-        <w:t xml:space="preserve">Strategic Management Journal</w:t>
-      </w:r>
-      <w:r>
-        <w:t xml:space="preserve">,</w:t>
-      </w:r>
-      <w:r>
-        <w:t xml:space="preserve"> </w:t>
-      </w:r>
-      <w:r>
-        <w:rPr>
-          <w:iCs/>
-          <w:i/>
-        </w:rPr>
-        <w:t xml:space="preserve">40</w:t>
+        <w:t xml:space="preserve">Strategic Management Journal, 40</w:t>
       </w:r>
       <w:r>
         <w:t xml:space="preserve">(3), 432–462.</w:t>
@@ -6731,7 +6224,7 @@
       <w:r>
         <w:t xml:space="preserve"> </w:t>
       </w:r>
-      <w:hyperlink r:id="rId104">
+      <w:hyperlink r:id="rId95">
         <w:r>
           <w:rPr>
             <w:rStyle w:val="Hyperlink"/>
@@ -6785,7 +6278,7 @@
       <w:r>
         <w:t xml:space="preserve"> </w:t>
       </w:r>
-      <w:hyperlink r:id="rId105">
+      <w:hyperlink r:id="rId96">
         <w:r>
           <w:rPr>
             <w:rStyle w:val="Hyperlink"/>
@@ -6817,7 +6310,7 @@
       <w:r>
         <w:t xml:space="preserve"> </w:t>
       </w:r>
-      <w:hyperlink r:id="rId106">
+      <w:hyperlink r:id="rId97">
         <w:r>
           <w:rPr>
             <w:rStyle w:val="Hyperlink"/>
@@ -6852,7 +6345,7 @@
       <w:r>
         <w:t xml:space="preserve"> </w:t>
       </w:r>
-      <w:hyperlink r:id="rId107">
+      <w:hyperlink r:id="rId98">
         <w:r>
           <w:rPr>
             <w:rStyle w:val="Hyperlink"/>
@@ -6884,7 +6377,7 @@
       <w:r>
         <w:t xml:space="preserve"> </w:t>
       </w:r>
-      <w:hyperlink r:id="rId108">
+      <w:hyperlink r:id="rId99">
         <w:r>
           <w:rPr>
             <w:rStyle w:val="Hyperlink"/>
@@ -6916,7 +6409,7 @@
       <w:r>
         <w:t xml:space="preserve"> </w:t>
       </w:r>
-      <w:hyperlink r:id="rId109">
+      <w:hyperlink r:id="rId100">
         <w:r>
           <w:rPr>
             <w:rStyle w:val="Hyperlink"/>
@@ -6946,7 +6439,7 @@
       <w:r>
         <w:t xml:space="preserve"> </w:t>
       </w:r>
-      <w:hyperlink r:id="rId73">
+      <w:hyperlink r:id="rId64">
         <w:r>
           <w:rPr>
             <w:rStyle w:val="Hyperlink"/>
@@ -6955,8 +6448,8 @@
         </w:r>
       </w:hyperlink>
     </w:p>
-    <w:bookmarkEnd w:id="110"/>
-    <w:bookmarkEnd w:id="111"/>
+    <w:bookmarkEnd w:id="101"/>
+    <w:bookmarkEnd w:id="102"/>
     <w:sectPr>
       <w:pgSz w:h="16838" w:w="11906"/>
       <w:pgMar w:bottom="1417" w:left="1417" w:right="1417" w:top="1417"/>

</xml_diff>

<commit_message>
fix(p4): remove internal process note from §4.4 figure caption area
Line 202 was an orphaned duplicate paragraph containing "(corrected per
reviewer fix #3: ...)" — an internal tracking note from the TP formula
correction, not intended for submission. Content already covered cleanly
in the preceding Figure 3 caption. Rebuilt MIR blinded docx and dist artifact.

https://claude.ai/code/session_01GMFmEtt6FYiJ4MKzBNCLqb
</commit_message>
<xml_diff>
--- a/dist/manuscripts/en/p4_singapore_en_clean.docx
+++ b/dist/manuscripts/en/p4_singapore_en_clean.docx
@@ -4233,12 +4233,6 @@
       </w:r>
       <w:r>
         <w:t xml:space="preserve">Predicted internationalization–performance curve. Predicted relationship between export intensity and labour productivity with 95% confidence bands from the canonical quadratic specification (M2). The implied turning point occurs near FSTS = 88.6% on the original scale (−β₁/2β₂ on mean-centered FSTS ≈ 84.1%; adding back the sample mean of 0.045 gives ≈ 88.6% — Aiken &amp; West, 1991), but its 95% percentile cluster-bootstrap confidence interval (5,000 replications) spans [53%, 253%] (median 80%, IQR [68%, 102%]); the inverted-U shape is recovered in 96.3% of bootstrap replications, but its precise location is only loosely identified. The shaded red vertical band marks the bootstrap CI for the turning point. The estimate should therefore be interpreted as descriptive of the data rather than as structurally identified evidence of an inverted-U.</w:t>
-      </w:r>
-      <w:r>
-        <w:t xml:space="preserve"> </w:t>
-      </w:r>
-      <w:r>
-        <w:t xml:space="preserve">Figure 3 visualizes the baseline quadratic fit between export intensity and labour productivity. The fitted curve implies a turning point near FSTS = 88.6% on the original scale (corrected per reviewer fix #3: −β₁/2β₂ applied to mean-centered FSTS ≈ 84.1%; +sample mean 0.045 ≈ 88.6%), but the point estimate is loosely identified — its 95% percentile bootstrap confidence interval spans [53%, 253%] — and lies in a sparsely populated upper tail of the sample. The Lind–Mehlum test does not formally confirm a conventional inverted-U at conventional significance levels. The appropriate interpretation is therefore not that the classic nonlinear literature is overturned, but that in this Singapore sample the right-side decline of the curve appears attenuated or shifted beyond the export range occupied by most firms in the data.</w:t>
       </w:r>
     </w:p>
     <w:bookmarkEnd w:id="51"/>

</xml_diff>

<commit_message>
build(p4): rebuild MIR blinded docx and dist — stale since 1558bea (3 commits behind)
P4 source updated in:
- a3eeabd: standardize APA7 journal/volume italic format in all 30 references
- cb25e7c: remove internal process note from §4.4 figure caption area
- 9e7cc55: remove second internal process note from §4.4 marginal effects

Both dist/manuscripts/en/p4_singapore_en_clean.docx and
p4/submission/mir_package/01_manuscript_blinded.docx now reflect current source.

https://claude.ai/code/session_01GMFmEtt6FYiJ4MKzBNCLqb
</commit_message>
<xml_diff>
--- a/dist/manuscripts/en/p4_singapore_en_clean.docx
+++ b/dist/manuscripts/en/p4_singapore_en_clean.docx
@@ -2,7 +2,7 @@
 <file path=word/document.xml><?xml version="1.0" encoding="utf-8"?>
 <w:document xmlns:w="http://schemas.openxmlformats.org/wordprocessingml/2006/main" xmlns:m="http://schemas.openxmlformats.org/officeDocument/2006/math" xmlns:r="http://schemas.openxmlformats.org/officeDocument/2006/relationships" xmlns:o="urn:schemas-microsoft-com:office:office" xmlns:v="urn:schemas-microsoft-com:vml" xmlns:w10="urn:schemas-microsoft-com:office:word" xmlns:a="http://schemas.openxmlformats.org/drawingml/2006/main" xmlns:pic="http://schemas.openxmlformats.org/drawingml/2006/picture" xmlns:wp="http://schemas.openxmlformats.org/drawingml/2006/wordprocessingDrawing">
   <w:body>
-    <w:bookmarkStart w:id="102" w:name="X07c3a2f9ec246b5120b9b19625fb58c0a5f9521"/>
+    <w:bookmarkStart w:id="111" w:name="X07c3a2f9ec246b5120b9b19625fb58c0a5f9521"/>
     <w:p>
       <w:pPr>
         <w:pStyle w:val="Heading1"/>
@@ -388,7 +388,7 @@
     </w:p>
     <w:bookmarkEnd w:id="28"/>
     <w:bookmarkEnd w:id="29"/>
-    <w:bookmarkStart w:id="38" w:name="X8bf20a63f0decf7b16e99d564b9958ec4fbbb23"/>
+    <w:bookmarkStart w:id="41" w:name="X8bf20a63f0decf7b16e99d564b9958ec4fbbb23"/>
     <w:p>
       <w:pPr>
         <w:pStyle w:val="Heading2"/>
@@ -720,7 +720,7 @@
     </w:p>
     <w:bookmarkEnd w:id="35"/>
     <w:bookmarkEnd w:id="36"/>
-    <w:bookmarkStart w:id="37" w:name="X120be97a373b91b5bab21d44e9895db7ca01e76"/>
+    <w:bookmarkStart w:id="40" w:name="X120be97a373b91b5bab21d44e9895db7ca01e76"/>
     <w:p>
       <w:pPr>
         <w:pStyle w:val="Heading3"/>
@@ -742,7 +742,46 @@
         <w:pStyle w:val="BodyText"/>
       </w:pPr>
       <w:r>
-        <w:t xml:space="preserve">Figure 1: Conceptual model — TCI and DAI moderating the I–P relationship (Singapore)</w:t>
+        <w:drawing>
+          <wp:inline>
+            <wp:extent cx="5753100" cy="3978568"/>
+            <wp:effectExtent b="0" l="0" r="0" t="0"/>
+            <wp:docPr descr="Figure 1: Conceptual model — TCI and DAI moderating the I–P relationship (Singapore)" title="" id="38" name="Picture"/>
+            <a:graphic>
+              <a:graphicData uri="http://schemas.openxmlformats.org/drawingml/2006/picture">
+                <pic:pic>
+                  <pic:nvPicPr>
+                    <pic:cNvPr descr="figures/p4_singapore/figure_1_conceptual_model.png" id="39" name="Picture"/>
+                    <pic:cNvPicPr>
+                      <a:picLocks noChangeArrowheads="1" noChangeAspect="1"/>
+                    </pic:cNvPicPr>
+                  </pic:nvPicPr>
+                  <pic:blipFill>
+                    <a:blip r:embed="rId37"/>
+                    <a:stretch>
+                      <a:fillRect/>
+                    </a:stretch>
+                  </pic:blipFill>
+                  <pic:spPr bwMode="auto">
+                    <a:xfrm>
+                      <a:off x="0" y="0"/>
+                      <a:ext cx="5753100" cy="3978568"/>
+                    </a:xfrm>
+                    <a:prstGeom prst="rect">
+                      <a:avLst/>
+                    </a:prstGeom>
+                    <a:noFill/>
+                    <a:ln w="9525">
+                      <a:noFill/>
+                      <a:headEnd/>
+                      <a:tailEnd/>
+                    </a:ln>
+                  </pic:spPr>
+                </pic:pic>
+              </a:graphicData>
+            </a:graphic>
+          </wp:inline>
+        </w:drawing>
       </w:r>
     </w:p>
     <w:p>
@@ -781,9 +820,9 @@
         <w:t xml:space="preserve">Solid arrows represent hypothesised direct effects; dashed arrows represent moderating and conditional effects. The independent variable — internationalisation intensity (FSTS, FSTS²_c) — is placed at left; the dependent variable — ln(labour productivity) — is placed at right. H1 (inverted-U tendency with support-constrained turning point ~88.6% FSTS, bootstrap CI [53%, 253%]) is grounded in coordination-cost theory (Hitt et al., 1997); the right-side decline is not formally identified within the observed FSTS range — a theoretically informative result under the saturation framework (Lind–Mehlum p = .303). H1-TCI: technological capability (TCI_z, RBV: Barney, 1991) enters as a direct level-shift to firm performance. H2: DAI (Tier-1+2: website + e-payment) exhibits a non-uniform positive direct effect, varying across export intensity. H3: DAI amplifies I→P performance returns at high FSTS — the primary contingency hypothesis (coordination platform mechanism: Stallkamp &amp; Schotter, 2021; Dynamic Capabilities: Teece, 2007). The Heckman two-step IMR sensitivity check controls exporter selection bias but is not displayed in the figure. (+) denotes positive association. Control variables (ln firm size, age, foreign ownership, sector FE) are included in all empirical models. Note: H3 amplification test conducted on exporters-only subsample (n ≈ 84; power ≈ 16% — corroborating signal, not independent identification). ICRV context: Singapore — Advanced I. Data: WBES 2023; N = 623.</w:t>
       </w:r>
     </w:p>
-    <w:bookmarkEnd w:id="37"/>
-    <w:bookmarkEnd w:id="38"/>
-    <w:bookmarkStart w:id="47" w:name="X167a2da0345881bf36eef0606d50b1063a572d3"/>
+    <w:bookmarkEnd w:id="40"/>
+    <w:bookmarkEnd w:id="41"/>
+    <w:bookmarkStart w:id="50" w:name="X167a2da0345881bf36eef0606d50b1063a572d3"/>
     <w:p>
       <w:pPr>
         <w:pStyle w:val="Heading2"/>
@@ -792,7 +831,7 @@
         <w:t xml:space="preserve">3 Methods</w:t>
       </w:r>
     </w:p>
-    <w:bookmarkStart w:id="39" w:name="X7539fb3dc2f98232f41138bc75cab658563f4ee"/>
+    <w:bookmarkStart w:id="42" w:name="X7539fb3dc2f98232f41138bc75cab658563f4ee"/>
     <w:p>
       <w:pPr>
         <w:pStyle w:val="Heading3"/>
@@ -827,8 +866,8 @@
         <w:t xml:space="preserve">The Singapore DAI distribution reveals high saturation: website presence is reported by approximately 67% of firms, and Tier-2 e-payment adoption (customer- and supplier-side) is widespread relative to less digitally mature institutional settings. This saturation pattern at the advanced-economy ceiling of the digital-infrastructure spectrum has two empirically relevant implications. First, the near-universal diffusion of Tier-1 digital presence removes the discriminatory power that the website indicator alone could carry in less digitally mature settings, so the empirical signal must be drawn from the Tier-2 transaction-enabling layer (e-payment intensity on both customer and supplier sides) to identify the conditional-scaling mechanism — a measurement implication that is borne out in the §4.5 R1 robustness diagnostic, where reducing DAI to Tier-1 alone substantially weakens the quadratic interaction. Second, in transitional-economy settings where Tier-1 digital adoption has diffused widely while Tier-2 transaction-enabling infrastructure remains institutionally bounded, the same construct measured at Tier-1 only would not be expected to produce a comparable positive quadratic interaction; instead it would be more plausibly read as construct-tier obsolescence than as evidence on the conditional-scaling mechanism (see §5.1 for the construct-boundary discussion). The Lind–Mehlum equivalence test result (p = .303) reported in §4.2 should therefore be interpreted in conjunction with the Tier-1+2 construct composition and the high domestic-orientation distribution of the Singapore sample, not as a stand-alone null on the inverted-U logic. Figure 3 [see Figures section] illustrates the predicted I–P curve and the sparse upper-tail region where the turning point is implied.</w:t>
       </w:r>
     </w:p>
-    <w:bookmarkEnd w:id="39"/>
-    <w:bookmarkStart w:id="44" w:name="Xbcf9f12e79107fa2c089aaf13fc6c4fb773f1c2"/>
+    <w:bookmarkEnd w:id="42"/>
+    <w:bookmarkStart w:id="47" w:name="Xbcf9f12e79107fa2c089aaf13fc6c4fb773f1c2"/>
     <w:p>
       <w:pPr>
         <w:pStyle w:val="Heading3"/>
@@ -837,7 +876,7 @@
         <w:t xml:space="preserve">3.2 Variables</w:t>
       </w:r>
     </w:p>
-    <w:bookmarkStart w:id="40" w:name="X7e58563e31c3ad002492190dd8d5308423faaad"/>
+    <w:bookmarkStart w:id="43" w:name="X7e58563e31c3ad002492190dd8d5308423faaad"/>
     <w:p>
       <w:pPr>
         <w:pStyle w:val="Heading4"/>
@@ -854,8 +893,8 @@
         <w:t xml:space="preserve">Firm performance is operationalized as labour productivity, measured as the natural logarithm of annual sales divided by the number of full-time employees. This measure is constructed from WBES annual sales and employment items and follows the productivity-as-performance approach used in prior firm-level international business research. Because all firms belong to the same 2023 cross-section, sales are expressed in nominal 2023 Singapore dollars, with any common price-level effect absorbed by the intercept. To reduce sensitivity to outliers, the dependent variable is winsorized at the 1st and 99th percentiles.</w:t>
       </w:r>
     </w:p>
-    <w:bookmarkEnd w:id="40"/>
-    <w:bookmarkStart w:id="41" w:name="X2cdc78afcfd9a4441a0b7b899a2b559f49a455a"/>
+    <w:bookmarkEnd w:id="43"/>
+    <w:bookmarkStart w:id="44" w:name="X2cdc78afcfd9a4441a0b7b899a2b559f49a455a"/>
     <w:p>
       <w:pPr>
         <w:pStyle w:val="Heading4"/>
@@ -872,8 +911,8 @@
         <w:t xml:space="preserve">The focal internationalization variable is FSTS, defined as the proportion of annual sales derived from direct exports and rescaled to the [0,1] interval. FSTS is mean-centered before squaring in order to mitigate multicollinearity between the linear and quadratic terms (Aiken &amp; West 1991). In the final specifications, variance inflation factors remain below 3, indicating that multicollinearity is not a material concern (O’Brien 2007).</w:t>
       </w:r>
     </w:p>
-    <w:bookmarkEnd w:id="41"/>
-    <w:bookmarkStart w:id="42" w:name="X5885cfa65cddf1d15b27f59176f9dbae5a8c10a"/>
+    <w:bookmarkEnd w:id="44"/>
+    <w:bookmarkStart w:id="45" w:name="X5885cfa65cddf1d15b27f59176f9dbae5a8c10a"/>
     <w:p>
       <w:pPr>
         <w:pStyle w:val="Heading4"/>
@@ -932,8 +971,8 @@
         <w:t xml:space="preserve">, PART C) and are consistent with the §1.3 supporting contribution on construct-tier specificity.</w:t>
       </w:r>
     </w:p>
-    <w:bookmarkEnd w:id="42"/>
-    <w:bookmarkStart w:id="43" w:name="X7f318314f3a5164dbb5d2e2bfe8bd11c34b488e"/>
+    <w:bookmarkEnd w:id="45"/>
+    <w:bookmarkStart w:id="46" w:name="X7f318314f3a5164dbb5d2e2bfe8bd11c34b488e"/>
     <w:p>
       <w:pPr>
         <w:pStyle w:val="Heading4"/>
@@ -950,9 +989,9 @@
         <w:t xml:space="preserve">The models include firm size, firm age, foreign ownership, and broad sector fixed effects as controls. Firm size is measured as the natural logarithm of the number of full-time employees, firm age is calculated from year of establishment, and foreign ownership is coded as an indicator for at least 10% foreign equity. Broad sector indicators distinguish manufacturing, retail, and other services and absorb sector-level heterogeneity in productivity, export propensity, and technology-adoption norms. Manager experience, originally motivated by the upper-echelons framework (Hambrick &amp; Mason 1984) and initially considered as a control, was dropped after variance-inflation diagnostics indicated problematic collinearity with firm size.</w:t>
       </w:r>
     </w:p>
-    <w:bookmarkEnd w:id="43"/>
-    <w:bookmarkEnd w:id="44"/>
-    <w:bookmarkStart w:id="45" w:name="X84482d10811f20e2a246857c008316fafc15eb6"/>
+    <w:bookmarkEnd w:id="46"/>
+    <w:bookmarkEnd w:id="47"/>
+    <w:bookmarkStart w:id="48" w:name="X84482d10811f20e2a246857c008316fafc15eb6"/>
     <w:p>
       <w:pPr>
         <w:pStyle w:val="Heading3"/>
@@ -1015,8 +1054,8 @@
         <w:t xml:space="preserve">a credible exclusion restriction can produce more biased estimates than the OLS baseline it is intended to correct. A reduced-form inverse-Mills-ratio sensitivity diagnostic for selection at the extensive margin of exporting is reported in §3.4 below for transparency, but is not treated as the primary specification. The associational nature of the OLS estimates is therefore acknowledged upfront, and inferential claims are bounded to within-context associations rather than causal effects.</w:t>
       </w:r>
     </w:p>
-    <w:bookmarkEnd w:id="45"/>
-    <w:bookmarkStart w:id="46" w:name="X4758c326240d97a48e7d79456dba8f6cc5c46be"/>
+    <w:bookmarkEnd w:id="48"/>
+    <w:bookmarkStart w:id="49" w:name="X4758c326240d97a48e7d79456dba8f6cc5c46be"/>
     <w:p>
       <w:pPr>
         <w:pStyle w:val="Heading3"/>
@@ -1187,9 +1226,9 @@
         <w:t xml:space="preserve">Read together, these four boundary conditions establish that (a) the upper-tail inverted-U decline is not formally identified within the supported data range — but is not expected to be identified, given the saturation framework; (b) the exporters-only specification provides a high-prior-strength corroborating signal rather than an independent identifying test; (c) the Lind–Mehlum null is a theoretically informative positive signal under the saturation hypothesis, not a methodological failure; and (d) the H3 amplification mechanism is robust to the Heckman sensitivity diagnostic. The §4 results below are reported on this consolidated identification scope, and §5 interprets the substantive findings without further re-litigation of these boundary conditions.</w:t>
       </w:r>
     </w:p>
-    <w:bookmarkEnd w:id="46"/>
-    <w:bookmarkEnd w:id="47"/>
-    <w:bookmarkStart w:id="53" w:name="X121719332867ee227f0a04b486098cee978c6e6"/>
+    <w:bookmarkEnd w:id="49"/>
+    <w:bookmarkEnd w:id="50"/>
+    <w:bookmarkStart w:id="62" w:name="X121719332867ee227f0a04b486098cee978c6e6"/>
     <w:p>
       <w:pPr>
         <w:pStyle w:val="Heading2"/>
@@ -1198,7 +1237,7 @@
         <w:t xml:space="preserve">4 Results</w:t>
       </w:r>
     </w:p>
-    <w:bookmarkStart w:id="48" w:name="Xcfcbc1028680fbd618b9b585dd17cf608861803"/>
+    <w:bookmarkStart w:id="51" w:name="Xcfcbc1028680fbd618b9b585dd17cf608861803"/>
     <w:p>
       <w:pPr>
         <w:pStyle w:val="Heading3"/>
@@ -1509,8 +1548,8 @@
         <w:t xml:space="preserve">Notes: N = 623. TCI and DAI are z-standardized formative composites. FSTS is the share of annual sales accounted for by direct exports. Two-tailed significance levels are reported as follows: p &lt; .10, p &lt; .05, p &lt; .01.</w:t>
       </w:r>
     </w:p>
-    <w:bookmarkEnd w:id="48"/>
-    <w:bookmarkStart w:id="49" w:name="Xe86cbbe4620ce5d84f78b7737e30408048ed6af"/>
+    <w:bookmarkEnd w:id="51"/>
+    <w:bookmarkStart w:id="52" w:name="Xe86cbbe4620ce5d84f78b7737e30408048ed6af"/>
     <w:p>
       <w:pPr>
         <w:pStyle w:val="Heading3"/>
@@ -1540,8 +1579,8 @@
         <w:t xml:space="preserve">. The most defensible interpretation is therefore not that the inverted-U is firmly established, but that the full-sample relationship is predominantly positive with mild quadratic curvature over the observed export-intensity range. In this sense, the quadratic fit is informative descriptively, while stronger claims about a structurally identified right-side decline remain beyond what the present data can support. Read this way, the evidence qualifies rather than overturns the conventional nonlinear literature, while keeping interpretation within the empirical support actually available in the Singapore sample.</w:t>
       </w:r>
     </w:p>
-    <w:bookmarkEnd w:id="49"/>
-    <w:bookmarkStart w:id="50" w:name="Xbd081e7d38ad07e1e46d233e5fbc3c3c47a4f64"/>
+    <w:bookmarkEnd w:id="52"/>
+    <w:bookmarkStart w:id="53" w:name="Xbd081e7d38ad07e1e46d233e5fbc3c3c47a4f64"/>
     <w:p>
       <w:pPr>
         <w:pStyle w:val="Heading3"/>
@@ -1564,8 +1603,8 @@
         <w:t xml:space="preserve">In the supplementary TCI-moderation specification (Model M3), the direct TCI coefficient remains positive and significant (β = 0.188, p &lt; .001), but the interaction terms involving FSTS and squared FSTS are jointly insignificant. Because the absence of moderation cannot be inferred from non-significance alone, the evidence is better read as supporting an intercept-dominant interpretation of the TCI association rather than as a definitive demonstration that curvature moderation is exactly zero. Taken together, the evidence is more consistent with an intercept-dominant reading of the TCI association than with a clearly identified moderation channel in the internationalization–performance relationship. This is also the most coherent reading for hypothesis development, because it preserves the distinction between internal capability depth and export-contingent digital complementarity.</w:t>
       </w:r>
     </w:p>
-    <w:bookmarkEnd w:id="50"/>
-    <w:bookmarkStart w:id="51" w:name="X0bc604979a3b7f5f87ce430a2a9c0e71ddd76f9"/>
+    <w:bookmarkEnd w:id="53"/>
+    <w:bookmarkStart w:id="60" w:name="X0bc604979a3b7f5f87ce430a2a9c0e71ddd76f9"/>
     <w:p>
       <w:pPr>
         <w:pStyle w:val="Heading3"/>
@@ -4190,7 +4229,46 @@
         <w:t xml:space="preserve"> </w:t>
       </w:r>
       <w:r>
-        <w:t xml:space="preserve">Figure 2: Marginal effects of DAI on log labour productivity at varying FSTS levels (Singapore, N=617)</w:t>
+        <w:drawing>
+          <wp:inline>
+            <wp:extent cx="5564514" cy="3588675"/>
+            <wp:effectExtent b="0" l="0" r="0" t="0"/>
+            <wp:docPr descr="Figure 2: Marginal effects of DAI on log labour productivity at varying FSTS levels (Singapore, N=617)" title="" id="55" name="Picture"/>
+            <a:graphic>
+              <a:graphicData uri="http://schemas.openxmlformats.org/drawingml/2006/picture">
+                <pic:pic>
+                  <pic:nvPicPr>
+                    <pic:cNvPr descr="figures/p4_singapore/figure_2_dai_marginal_effect.png" id="56" name="Picture"/>
+                    <pic:cNvPicPr>
+                      <a:picLocks noChangeArrowheads="1" noChangeAspect="1"/>
+                    </pic:cNvPicPr>
+                  </pic:nvPicPr>
+                  <pic:blipFill>
+                    <a:blip r:embed="rId54"/>
+                    <a:stretch>
+                      <a:fillRect/>
+                    </a:stretch>
+                  </pic:blipFill>
+                  <pic:spPr bwMode="auto">
+                    <a:xfrm>
+                      <a:off x="0" y="0"/>
+                      <a:ext cx="5564514" cy="3588675"/>
+                    </a:xfrm>
+                    <a:prstGeom prst="rect">
+                      <a:avLst/>
+                    </a:prstGeom>
+                    <a:noFill/>
+                    <a:ln w="9525">
+                      <a:noFill/>
+                      <a:headEnd/>
+                      <a:tailEnd/>
+                    </a:ln>
+                  </pic:spPr>
+                </pic:pic>
+              </a:graphicData>
+            </a:graphic>
+          </wp:inline>
+        </w:drawing>
       </w:r>
     </w:p>
     <w:p>
@@ -4214,7 +4292,46 @@
         <w:t xml:space="preserve"> </w:t>
       </w:r>
       <w:r>
-        <w:t xml:space="preserve">Figure 3: Predicted I–P curve with bootstrap confidence band (Singapore, OLS M2)</w:t>
+        <w:drawing>
+          <wp:inline>
+            <wp:extent cx="5422070" cy="3593270"/>
+            <wp:effectExtent b="0" l="0" r="0" t="0"/>
+            <wp:docPr descr="Figure 3: Predicted I–P curve with bootstrap confidence band (Singapore, OLS M2)" title="" id="58" name="Picture"/>
+            <a:graphic>
+              <a:graphicData uri="http://schemas.openxmlformats.org/drawingml/2006/picture">
+                <pic:pic>
+                  <pic:nvPicPr>
+                    <pic:cNvPr descr="figures/p4_singapore/figure_3_predicted_ip_curve.png" id="59" name="Picture"/>
+                    <pic:cNvPicPr>
+                      <a:picLocks noChangeArrowheads="1" noChangeAspect="1"/>
+                    </pic:cNvPicPr>
+                  </pic:nvPicPr>
+                  <pic:blipFill>
+                    <a:blip r:embed="rId57"/>
+                    <a:stretch>
+                      <a:fillRect/>
+                    </a:stretch>
+                  </pic:blipFill>
+                  <pic:spPr bwMode="auto">
+                    <a:xfrm>
+                      <a:off x="0" y="0"/>
+                      <a:ext cx="5422070" cy="3593270"/>
+                    </a:xfrm>
+                    <a:prstGeom prst="rect">
+                      <a:avLst/>
+                    </a:prstGeom>
+                    <a:noFill/>
+                    <a:ln w="9525">
+                      <a:noFill/>
+                      <a:headEnd/>
+                      <a:tailEnd/>
+                    </a:ln>
+                  </pic:spPr>
+                </pic:pic>
+              </a:graphicData>
+            </a:graphic>
+          </wp:inline>
+        </w:drawing>
       </w:r>
     </w:p>
     <w:p>
@@ -4235,8 +4352,8 @@
         <w:t xml:space="preserve">Predicted internationalization–performance curve. Predicted relationship between export intensity and labour productivity with 95% confidence bands from the canonical quadratic specification (M2). The implied turning point occurs near FSTS = 88.6% on the original scale (−β₁/2β₂ on mean-centered FSTS ≈ 84.1%; adding back the sample mean of 0.045 gives ≈ 88.6% — Aiken &amp; West, 1991), but its 95% percentile cluster-bootstrap confidence interval (5,000 replications) spans [53%, 253%] (median 80%, IQR [68%, 102%]); the inverted-U shape is recovered in 96.3% of bootstrap replications, but its precise location is only loosely identified. The shaded red vertical band marks the bootstrap CI for the turning point. The estimate should therefore be interpreted as descriptive of the data rather than as structurally identified evidence of an inverted-U.</w:t>
       </w:r>
     </w:p>
-    <w:bookmarkEnd w:id="51"/>
-    <w:bookmarkStart w:id="52" w:name="Xc8e997e14555d7ba8da5c1d596c5311617447cd"/>
+    <w:bookmarkEnd w:id="60"/>
+    <w:bookmarkStart w:id="61" w:name="Xc8e997e14555d7ba8da5c1d596c5311617447cd"/>
     <w:p>
       <w:pPr>
         <w:pStyle w:val="Heading3"/>
@@ -4888,9 +5005,9 @@
         <w:t xml:space="preserve">Table 3 evaluates whether the core inference is sensitive to measurement choice and sample composition. Across all reported robustness specifications, the quadratic DAI moderation term retains a positive sign, which strengthens confidence that the main result is not driven by a single operational decision. At the same time, the weakening of statistical significance in the thinner website-only specification suggests that the richer DAI baseline draws meaningful explanatory variation from the electronic-payment indicators in addition to simple digital presence. The exporters-only subsample is less stable because the number of exporting firms is limited and the right tail of export intensity remains thin, so these estimates should be interpreted cautiously. Taken together, the robustness results support the argument that foundational digital adoption acts as a contingent scaling complement, while also reinforcing that the evidence is strongest when interpreted within the Tier 1–2 measurement boundary of the DAI construct.</w:t>
       </w:r>
     </w:p>
-    <w:bookmarkEnd w:id="52"/>
-    <w:bookmarkEnd w:id="53"/>
-    <w:bookmarkStart w:id="56" w:name="X735612638e4e736e4693e459c258977262c0dfc"/>
+    <w:bookmarkEnd w:id="61"/>
+    <w:bookmarkEnd w:id="62"/>
+    <w:bookmarkStart w:id="65" w:name="X735612638e4e736e4693e459c258977262c0dfc"/>
     <w:p>
       <w:pPr>
         <w:pStyle w:val="Heading2"/>
@@ -4899,7 +5016,7 @@
         <w:t xml:space="preserve">5 Discussion</w:t>
       </w:r>
     </w:p>
-    <w:bookmarkStart w:id="54" w:name="X027b31c2d090a00917aa7291770680fd40b64cd"/>
+    <w:bookmarkStart w:id="63" w:name="X027b31c2d090a00917aa7291770680fd40b64cd"/>
     <w:p>
       <w:pPr>
         <w:pStyle w:val="Heading3"/>
@@ -5036,8 +5153,8 @@
         <w:t xml:space="preserve">The institutional transferability of the amplification finding rests on a construct-tier distinction with direct policy implications. In Singapore, the DAI composite captures Tier-1+2 digital capability — website presence (c22b) combined with electronic payment integration (k33/k38) embedded in the public digital infrastructure — enabling firms to execute frictionless cross-border transactions. In contrast, in transitional economies where Tier-2 payment infrastructure remains institutionally bounded — settings where cross-border electronic-payment rails reached systemic scale only in the late 2010s, as documented across lower-middle-income Asia in World Bank digital infrastructure assessments (World Bank, 2023) — the WBES website indicator captures Tier-1 presence only, and the amplification mechanism loses empirical legibility because the payment-integration channel is absent. The implication is that the amplification ceiling is not a Singapore-specific idiosyncrasy but a Tier-1+2 threshold effect: economies that upgrade payment infrastructure to Tier-2 coverage should expect the conditional complementarity pattern to become empirically detectable. This reframes Singapore from an outlier case to a leading indicator of where Tier-2 adoption leads.</w:t>
       </w:r>
     </w:p>
-    <w:bookmarkEnd w:id="54"/>
-    <w:bookmarkStart w:id="55" w:name="Xa4e692b259d9b803bab54ad026a7e8d888a5d2c"/>
+    <w:bookmarkEnd w:id="63"/>
+    <w:bookmarkStart w:id="64" w:name="Xa4e692b259d9b803bab54ad026a7e8d888a5d2c"/>
     <w:p>
       <w:pPr>
         <w:pStyle w:val="Heading3"/>
@@ -5066,9 +5183,9 @@
         <w:t xml:space="preserve">More broadly, the findings imply that managers should avoid treating technological capability and digital adoption as interchangeable investment categories. Investments in technological capability appear to support a broader productivity base, whereas investments in foundational digital adoption become more relevant when firms face the coordination intensity associated with deeper internationalization. This suggests that capability-building and digitalization strategies should be sequenced and matched to the firm’s actual stage of export expansion rather than pursued as a single undifferentiated digital-capability agenda.</w:t>
       </w:r>
     </w:p>
-    <w:bookmarkEnd w:id="55"/>
-    <w:bookmarkEnd w:id="56"/>
-    <w:bookmarkStart w:id="57" w:name="X6b297cc947e0db5526be369b1f0f4ddc67b2415"/>
+    <w:bookmarkEnd w:id="64"/>
+    <w:bookmarkEnd w:id="65"/>
+    <w:bookmarkStart w:id="66" w:name="X6b297cc947e0db5526be369b1f0f4ddc67b2415"/>
     <w:p>
       <w:pPr>
         <w:pStyle w:val="Heading2"/>
@@ -5097,8 +5214,8 @@
         <w:t xml:space="preserve">More broadly, the study contributes to international business research by sharpening construct interpretation and by showing that technological capability and foundational digital adoption are associated with performance through different empirical patterns. Technological capability shows the more stable positive association with productivity, whereas foundational digital adoption is better interpreted as a conditional scaling resource whose relevance becomes more visible only where cross-border coordination demands are relatively intense. These conclusions are deliberately bounded to the present design and setting, and they point toward the need for comparative and longitudinal research before broader cross-setting claims about how digitalization shapes the I–P pattern can be sustained.</w:t>
       </w:r>
     </w:p>
-    <w:bookmarkEnd w:id="57"/>
-    <w:bookmarkStart w:id="58" w:name="X422fdd10c3908fe492ea939b97371c73422dbba"/>
+    <w:bookmarkEnd w:id="66"/>
+    <w:bookmarkStart w:id="67" w:name="X422fdd10c3908fe492ea939b97371c73422dbba"/>
     <w:p>
       <w:pPr>
         <w:pStyle w:val="Heading2"/>
@@ -5127,8 +5244,8 @@
         <w:t xml:space="preserve">Third, the estimated digital-adoption effect should be interpreted within the measurement boundary of the available indicators. The DAI construct captures Tier 1–2 digital adoption — digital presence and electronic-transaction usage — rather than deeper digitally integrated organizational capability or digital dynamic capability; indicator-sensitivity analysis shows that the moderation pattern depends on the foundational digital-infrastructure indicators and weakens when those specific items are dropped. Future research should therefore examine whether the same conditional pattern appears in other digitally advanced economies and under richer measures that capture process integration, organizational digitalization, and higher-order digital capabilities more directly. Panel data, successive enterprise-survey waves, linked administrative records, and stronger quasi-experimental designs — including instrumental-variable or difference-in-differences specifications keyed to digital-infrastructure rollouts or trade-policy shocks — would also help clarify whether the observed associations reflect scaling complementarities, selection effects, or other mechanisms. Concrete instrumental-variable strategies could exploit firm-to-port distance or local customs-clearance times as instruments for export intensity, and regional broadband-coverage shares or within-sector peer-adoption rates as instruments for foundational digital adoption, although Wolfolds and Siegel (2019) caution that such designs require both adequate first-stage strength and credible exclusion restrictions before they can deliver clean causal identification.</w:t>
       </w:r>
     </w:p>
-    <w:bookmarkEnd w:id="58"/>
-    <w:bookmarkStart w:id="60" w:name="data-availability-statement"/>
+    <w:bookmarkEnd w:id="67"/>
+    <w:bookmarkStart w:id="69" w:name="data-availability-statement"/>
     <w:p>
       <w:pPr>
         <w:pStyle w:val="Heading2"/>
@@ -5147,7 +5264,7 @@
       <w:r>
         <w:t xml:space="preserve"> </w:t>
       </w:r>
-      <w:hyperlink r:id="rId59">
+      <w:hyperlink r:id="rId68">
         <w:r>
           <w:rPr>
             <w:rStyle w:val="Hyperlink"/>
@@ -5159,8 +5276,8 @@
         <w:t xml:space="preserve">. Analysis scripts to replicate the results are available from the corresponding author on reasonable request.</w:t>
       </w:r>
     </w:p>
-    <w:bookmarkEnd w:id="60"/>
-    <w:bookmarkStart w:id="61" w:name="acknowledgements"/>
+    <w:bookmarkEnd w:id="69"/>
+    <w:bookmarkStart w:id="70" w:name="acknowledgements"/>
     <w:p>
       <w:pPr>
         <w:pStyle w:val="Heading2"/>
@@ -5177,8 +5294,8 @@
         <w:t xml:space="preserve">We thank the Enterprise Analysis Unit of the Development Economics Global Indicators Group of the World Bank for the data.</w:t>
       </w:r>
     </w:p>
-    <w:bookmarkEnd w:id="61"/>
-    <w:bookmarkStart w:id="62" w:name="funding"/>
+    <w:bookmarkEnd w:id="70"/>
+    <w:bookmarkStart w:id="71" w:name="funding"/>
     <w:p>
       <w:pPr>
         <w:pStyle w:val="Heading2"/>
@@ -5195,8 +5312,8 @@
         <w:t xml:space="preserve">This research received no external funding.</w:t>
       </w:r>
     </w:p>
-    <w:bookmarkEnd w:id="62"/>
-    <w:bookmarkStart w:id="63" w:name="conflict-of-interest"/>
+    <w:bookmarkEnd w:id="71"/>
+    <w:bookmarkStart w:id="72" w:name="conflict-of-interest"/>
     <w:p>
       <w:pPr>
         <w:pStyle w:val="Heading2"/>
@@ -5213,8 +5330,8 @@
         <w:t xml:space="preserve">The authors declare no conflicts of interest.</w:t>
       </w:r>
     </w:p>
-    <w:bookmarkEnd w:id="63"/>
-    <w:bookmarkStart w:id="65" w:name="ai-and-data-availability"/>
+    <w:bookmarkEnd w:id="72"/>
+    <w:bookmarkStart w:id="74" w:name="ai-and-data-availability"/>
     <w:p>
       <w:pPr>
         <w:pStyle w:val="Heading2"/>
@@ -5255,7 +5372,7 @@
       <w:r>
         <w:t xml:space="preserve"> </w:t>
       </w:r>
-      <w:hyperlink r:id="rId64">
+      <w:hyperlink r:id="rId73">
         <w:r>
           <w:rPr>
             <w:rStyle w:val="Hyperlink"/>
@@ -5274,8 +5391,8 @@
         </w:pict>
       </w:r>
     </w:p>
-    <w:bookmarkEnd w:id="65"/>
-    <w:bookmarkStart w:id="101" w:name="references"/>
+    <w:bookmarkEnd w:id="74"/>
+    <w:bookmarkStart w:id="110" w:name="references"/>
     <w:p>
       <w:pPr>
         <w:pStyle w:val="Heading2"/>
@@ -5307,7 +5424,7 @@
       <w:r>
         <w:t xml:space="preserve"> </w:t>
       </w:r>
-      <w:hyperlink r:id="rId66">
+      <w:hyperlink r:id="rId75">
         <w:r>
           <w:rPr>
             <w:rStyle w:val="Hyperlink"/>
@@ -5356,7 +5473,7 @@
       <w:r>
         <w:t xml:space="preserve"> </w:t>
       </w:r>
-      <w:hyperlink r:id="rId67">
+      <w:hyperlink r:id="rId76">
         <w:r>
           <w:rPr>
             <w:rStyle w:val="Hyperlink"/>
@@ -5386,7 +5503,7 @@
       <w:r>
         <w:t xml:space="preserve"> </w:t>
       </w:r>
-      <w:hyperlink r:id="rId68">
+      <w:hyperlink r:id="rId77">
         <w:r>
           <w:rPr>
             <w:rStyle w:val="Hyperlink"/>
@@ -5416,7 +5533,7 @@
       <w:r>
         <w:t xml:space="preserve"> </w:t>
       </w:r>
-      <w:hyperlink r:id="rId69">
+      <w:hyperlink r:id="rId78">
         <w:r>
           <w:rPr>
             <w:rStyle w:val="Hyperlink"/>
@@ -5446,7 +5563,7 @@
       <w:r>
         <w:t xml:space="preserve"> </w:t>
       </w:r>
-      <w:hyperlink r:id="rId70">
+      <w:hyperlink r:id="rId79">
         <w:r>
           <w:rPr>
             <w:rStyle w:val="Hyperlink"/>
@@ -5476,7 +5593,7 @@
       <w:r>
         <w:t xml:space="preserve"> </w:t>
       </w:r>
-      <w:hyperlink r:id="rId71">
+      <w:hyperlink r:id="rId80">
         <w:r>
           <w:rPr>
             <w:rStyle w:val="Hyperlink"/>
@@ -5506,7 +5623,7 @@
       <w:r>
         <w:t xml:space="preserve"> </w:t>
       </w:r>
-      <w:hyperlink r:id="rId72">
+      <w:hyperlink r:id="rId81">
         <w:r>
           <w:rPr>
             <w:rStyle w:val="Hyperlink"/>
@@ -5558,7 +5675,7 @@
       <w:r>
         <w:t xml:space="preserve"> </w:t>
       </w:r>
-      <w:hyperlink r:id="rId73">
+      <w:hyperlink r:id="rId82">
         <w:r>
           <w:rPr>
             <w:rStyle w:val="Hyperlink"/>
@@ -5588,7 +5705,7 @@
       <w:r>
         <w:t xml:space="preserve"> </w:t>
       </w:r>
-      <w:hyperlink r:id="rId74">
+      <w:hyperlink r:id="rId83">
         <w:r>
           <w:rPr>
             <w:rStyle w:val="Hyperlink"/>
@@ -5618,7 +5735,7 @@
       <w:r>
         <w:t xml:space="preserve"> </w:t>
       </w:r>
-      <w:hyperlink r:id="rId75">
+      <w:hyperlink r:id="rId84">
         <w:r>
           <w:rPr>
             <w:rStyle w:val="Hyperlink"/>
@@ -5648,7 +5765,7 @@
       <w:r>
         <w:t xml:space="preserve"> </w:t>
       </w:r>
-      <w:hyperlink r:id="rId76">
+      <w:hyperlink r:id="rId85">
         <w:r>
           <w:rPr>
             <w:rStyle w:val="Hyperlink"/>
@@ -5678,7 +5795,7 @@
       <w:r>
         <w:t xml:space="preserve"> </w:t>
       </w:r>
-      <w:hyperlink r:id="rId77">
+      <w:hyperlink r:id="rId86">
         <w:r>
           <w:rPr>
             <w:rStyle w:val="Hyperlink"/>
@@ -5708,7 +5825,7 @@
       <w:r>
         <w:t xml:space="preserve"> </w:t>
       </w:r>
-      <w:hyperlink r:id="rId78">
+      <w:hyperlink r:id="rId87">
         <w:r>
           <w:rPr>
             <w:rStyle w:val="Hyperlink"/>
@@ -5738,7 +5855,7 @@
       <w:r>
         <w:t xml:space="preserve"> </w:t>
       </w:r>
-      <w:hyperlink r:id="rId79">
+      <w:hyperlink r:id="rId88">
         <w:r>
           <w:rPr>
             <w:rStyle w:val="Hyperlink"/>
@@ -5768,7 +5885,7 @@
       <w:r>
         <w:t xml:space="preserve"> </w:t>
       </w:r>
-      <w:hyperlink r:id="rId80">
+      <w:hyperlink r:id="rId89">
         <w:r>
           <w:rPr>
             <w:rStyle w:val="Hyperlink"/>
@@ -5798,7 +5915,7 @@
       <w:r>
         <w:t xml:space="preserve"> </w:t>
       </w:r>
-      <w:hyperlink r:id="rId81">
+      <w:hyperlink r:id="rId90">
         <w:r>
           <w:rPr>
             <w:rStyle w:val="Hyperlink"/>
@@ -5828,7 +5945,7 @@
       <w:r>
         <w:t xml:space="preserve"> </w:t>
       </w:r>
-      <w:hyperlink r:id="rId82">
+      <w:hyperlink r:id="rId91">
         <w:r>
           <w:rPr>
             <w:rStyle w:val="Hyperlink"/>
@@ -5858,7 +5975,7 @@
       <w:r>
         <w:t xml:space="preserve"> </w:t>
       </w:r>
-      <w:hyperlink r:id="rId83">
+      <w:hyperlink r:id="rId92">
         <w:r>
           <w:rPr>
             <w:rStyle w:val="Hyperlink"/>
@@ -5888,7 +6005,7 @@
       <w:r>
         <w:t xml:space="preserve"> </w:t>
       </w:r>
-      <w:hyperlink r:id="rId84">
+      <w:hyperlink r:id="rId93">
         <w:r>
           <w:rPr>
             <w:rStyle w:val="Hyperlink"/>
@@ -5918,7 +6035,7 @@
       <w:r>
         <w:t xml:space="preserve"> </w:t>
       </w:r>
-      <w:hyperlink r:id="rId85">
+      <w:hyperlink r:id="rId94">
         <w:r>
           <w:rPr>
             <w:rStyle w:val="Hyperlink"/>
@@ -5948,7 +6065,7 @@
       <w:r>
         <w:t xml:space="preserve"> </w:t>
       </w:r>
-      <w:hyperlink r:id="rId86">
+      <w:hyperlink r:id="rId95">
         <w:r>
           <w:rPr>
             <w:rStyle w:val="Hyperlink"/>
@@ -5978,7 +6095,7 @@
       <w:r>
         <w:t xml:space="preserve"> </w:t>
       </w:r>
-      <w:hyperlink r:id="rId87">
+      <w:hyperlink r:id="rId96">
         <w:r>
           <w:rPr>
             <w:rStyle w:val="Hyperlink"/>
@@ -6008,7 +6125,7 @@
       <w:r>
         <w:t xml:space="preserve"> </w:t>
       </w:r>
-      <w:hyperlink r:id="rId88">
+      <w:hyperlink r:id="rId97">
         <w:r>
           <w:rPr>
             <w:rStyle w:val="Hyperlink"/>
@@ -6038,7 +6155,7 @@
       <w:r>
         <w:t xml:space="preserve"> </w:t>
       </w:r>
-      <w:hyperlink r:id="rId89">
+      <w:hyperlink r:id="rId98">
         <w:r>
           <w:rPr>
             <w:rStyle w:val="Hyperlink"/>
@@ -6068,7 +6185,7 @@
       <w:r>
         <w:t xml:space="preserve"> </w:t>
       </w:r>
-      <w:hyperlink r:id="rId90">
+      <w:hyperlink r:id="rId99">
         <w:r>
           <w:rPr>
             <w:rStyle w:val="Hyperlink"/>
@@ -6098,7 +6215,7 @@
       <w:r>
         <w:t xml:space="preserve"> </w:t>
       </w:r>
-      <w:hyperlink r:id="rId91">
+      <w:hyperlink r:id="rId100">
         <w:r>
           <w:rPr>
             <w:rStyle w:val="Hyperlink"/>
@@ -6128,7 +6245,7 @@
       <w:r>
         <w:t xml:space="preserve"> </w:t>
       </w:r>
-      <w:hyperlink r:id="rId92">
+      <w:hyperlink r:id="rId101">
         <w:r>
           <w:rPr>
             <w:rStyle w:val="Hyperlink"/>
@@ -6158,7 +6275,7 @@
       <w:r>
         <w:t xml:space="preserve"> </w:t>
       </w:r>
-      <w:hyperlink r:id="rId93">
+      <w:hyperlink r:id="rId102">
         <w:r>
           <w:rPr>
             <w:rStyle w:val="Hyperlink"/>
@@ -6188,7 +6305,7 @@
       <w:r>
         <w:t xml:space="preserve"> </w:t>
       </w:r>
-      <w:hyperlink r:id="rId94">
+      <w:hyperlink r:id="rId103">
         <w:r>
           <w:rPr>
             <w:rStyle w:val="Hyperlink"/>
@@ -6218,7 +6335,7 @@
       <w:r>
         <w:t xml:space="preserve"> </w:t>
       </w:r>
-      <w:hyperlink r:id="rId95">
+      <w:hyperlink r:id="rId104">
         <w:r>
           <w:rPr>
             <w:rStyle w:val="Hyperlink"/>
@@ -6272,7 +6389,7 @@
       <w:r>
         <w:t xml:space="preserve"> </w:t>
       </w:r>
-      <w:hyperlink r:id="rId96">
+      <w:hyperlink r:id="rId105">
         <w:r>
           <w:rPr>
             <w:rStyle w:val="Hyperlink"/>
@@ -6304,7 +6421,7 @@
       <w:r>
         <w:t xml:space="preserve"> </w:t>
       </w:r>
-      <w:hyperlink r:id="rId97">
+      <w:hyperlink r:id="rId106">
         <w:r>
           <w:rPr>
             <w:rStyle w:val="Hyperlink"/>
@@ -6339,7 +6456,7 @@
       <w:r>
         <w:t xml:space="preserve"> </w:t>
       </w:r>
-      <w:hyperlink r:id="rId98">
+      <w:hyperlink r:id="rId107">
         <w:r>
           <w:rPr>
             <w:rStyle w:val="Hyperlink"/>
@@ -6371,7 +6488,7 @@
       <w:r>
         <w:t xml:space="preserve"> </w:t>
       </w:r>
-      <w:hyperlink r:id="rId99">
+      <w:hyperlink r:id="rId108">
         <w:r>
           <w:rPr>
             <w:rStyle w:val="Hyperlink"/>
@@ -6403,7 +6520,7 @@
       <w:r>
         <w:t xml:space="preserve"> </w:t>
       </w:r>
-      <w:hyperlink r:id="rId100">
+      <w:hyperlink r:id="rId109">
         <w:r>
           <w:rPr>
             <w:rStyle w:val="Hyperlink"/>
@@ -6433,7 +6550,7 @@
       <w:r>
         <w:t xml:space="preserve"> </w:t>
       </w:r>
-      <w:hyperlink r:id="rId64">
+      <w:hyperlink r:id="rId73">
         <w:r>
           <w:rPr>
             <w:rStyle w:val="Hyperlink"/>
@@ -6442,8 +6559,8 @@
         </w:r>
       </w:hyperlink>
     </w:p>
-    <w:bookmarkEnd w:id="101"/>
-    <w:bookmarkEnd w:id="102"/>
+    <w:bookmarkEnd w:id="110"/>
+    <w:bookmarkEnd w:id="111"/>
     <w:sectPr>
       <w:pgSz w:h="16838" w:w="11906"/>
       <w:pgMar w:bottom="1417" w:left="1417" w:right="1417" w:top="1417"/>

</xml_diff>